<commit_message>
OV08: rebuild started review + golden through the canonical Epic renderer (build_world_files.build_one) instead of ad-hoc python-docx; real masthead/storyboard/encounter chrome, disposition table, auto metadata scrub + GUARD
</commit_message>
<xml_diff>
--- a/worlds/ondina-vasquell/phase-3-build-task-artifacts/platform/task8/current/golden-OV08-v1.docx
+++ b/worlds/ondina-vasquell/phase-3-build-task-artifacts/platform/task8/current/golden-OV08-v1.docx
@@ -2,418 +2,552 @@
 <file path=word/document.xml><?xml version="1.0" encoding="utf-8"?>
 <w:document xmlns:wpc="http://schemas.microsoft.com/office/word/2010/wordprocessingCanvas" xmlns:mo="http://schemas.microsoft.com/office/mac/office/2008/main" xmlns:mc="http://schemas.openxmlformats.org/markup-compatibility/2006" xmlns:mv="urn:schemas-microsoft-com:mac:vml" xmlns:o="urn:schemas-microsoft-com:office:office" xmlns:r="http://schemas.openxmlformats.org/officeDocument/2006/relationships" xmlns:m="http://schemas.openxmlformats.org/officeDocument/2006/math" xmlns:v="urn:schemas-microsoft-com:vml" xmlns:wp14="http://schemas.microsoft.com/office/word/2010/wordprocessingDrawing" xmlns:wp="http://schemas.openxmlformats.org/drawingml/2006/wordprocessingDrawing" xmlns:w10="urn:schemas-microsoft-com:office:word" xmlns:w="http://schemas.openxmlformats.org/wordprocessingml/2006/main" xmlns:w14="http://schemas.microsoft.com/office/word/2010/wordml" xmlns:wpg="http://schemas.microsoft.com/office/word/2010/wordprocessingGroup" xmlns:wpi="http://schemas.microsoft.com/office/word/2010/wordprocessingInk" xmlns:wne="http://schemas.microsoft.com/office/word/2006/wordml" xmlns:wps="http://schemas.microsoft.com/office/word/2010/wordprocessingShape" mc:Ignorable="w14 wp14">
   <w:body>
+    <w:tbl>
+      <w:tblPr>
+        <w:tblW w:type="auto" w:w="0"/>
+        <w:tblLook w:firstColumn="1" w:firstRow="1" w:lastColumn="0" w:lastRow="0" w:noHBand="0" w:noVBand="1" w:val="04A0"/>
+        <w:tblBorders>
+          <w:top w:val="none"/>
+          <w:left w:val="none"/>
+          <w:bottom w:val="none"/>
+          <w:right w:val="none"/>
+          <w:insideH w:val="none"/>
+          <w:insideV w:val="none"/>
+        </w:tblBorders>
+      </w:tblPr>
+      <w:tblGrid>
+        <w:gridCol w:w="5184"/>
+        <w:gridCol w:w="5184"/>
+      </w:tblGrid>
+      <w:tr>
+        <w:tc>
+          <w:tcPr>
+            <w:tcW w:type="dxa" w:w="5184"/>
+          </w:tcPr>
+          <w:p>
+            <w:r>
+              <w:rPr>
+                <w:rFonts w:ascii="Arial" w:hAnsi="Arial"/>
+                <w:b/>
+                <w:i w:val="0"/>
+                <w:color w:val="1F3864"/>
+                <w:sz w:val="22"/>
+              </w:rPr>
+              <w:t>Harbor Crest Regional Medical Center</w:t>
+            </w:r>
+          </w:p>
+          <w:p>
+            <w:r>
+              <w:rPr>
+                <w:rFonts w:ascii="Arial" w:hAnsi="Arial"/>
+                <w:b w:val="0"/>
+                <w:i w:val="0"/>
+                <w:color w:val="5E6670"/>
+                <w:sz w:val="16"/>
+              </w:rPr>
+              <w:t>Utilization Review</w:t>
+            </w:r>
+          </w:p>
+        </w:tc>
+        <w:tc>
+          <w:tcPr>
+            <w:tcW w:type="dxa" w:w="5184"/>
+          </w:tcPr>
+          <w:p>
+            <w:pPr>
+              <w:jc w:val="right"/>
+            </w:pPr>
+            <w:r>
+              <w:rPr>
+                <w:rFonts w:ascii="Arial" w:hAnsi="Arial"/>
+                <w:b/>
+                <w:i w:val="0"/>
+                <w:color w:val="4472C4"/>
+                <w:sz w:val="17"/>
+              </w:rPr>
+              <w:t>Confidential</w:t>
+            </w:r>
+          </w:p>
+        </w:tc>
+      </w:tr>
+    </w:tbl>
+    <w:tbl>
+      <w:tblPr>
+        <w:tblW w:type="auto" w:w="0"/>
+        <w:tblLook w:firstColumn="1" w:firstRow="1" w:lastColumn="0" w:lastRow="0" w:noHBand="0" w:noVBand="1" w:val="04A0"/>
+        <w:tblBorders>
+          <w:top w:val="none"/>
+          <w:left w:val="none"/>
+          <w:bottom w:val="none"/>
+          <w:right w:val="none"/>
+          <w:insideH w:val="none"/>
+          <w:insideV w:val="none"/>
+        </w:tblBorders>
+      </w:tblPr>
+      <w:tblGrid>
+        <w:gridCol w:w="10368"/>
+      </w:tblGrid>
+      <w:tr>
+        <w:trPr>
+          <w:trHeight w:val="40"/>
+        </w:trPr>
+        <w:tc>
+          <w:tcPr>
+            <w:tcW w:type="dxa" w:w="10368"/>
+            <w:shd w:val="clear" w:fill="4472C4"/>
+          </w:tcPr>
+          <w:p/>
+        </w:tc>
+      </w:tr>
+    </w:tbl>
+    <w:tbl>
+      <w:tblPr>
+        <w:tblW w:type="auto" w:w="0"/>
+        <w:tblLook w:firstColumn="1" w:firstRow="1" w:lastColumn="0" w:lastRow="0" w:noHBand="0" w:noVBand="1" w:val="04A0"/>
+        <w:tblBorders>
+          <w:top w:val="single" w:sz="4" w:color="C9D4EA"/>
+          <w:left w:val="single" w:sz="4" w:color="C9D4EA"/>
+          <w:bottom w:val="single" w:sz="4" w:color="C9D4EA"/>
+          <w:right w:val="single" w:sz="4" w:color="C9D4EA"/>
+          <w:insideH w:val="single" w:sz="4" w:color="C9D4EA"/>
+          <w:insideV w:val="single" w:sz="4" w:color="C9D4EA"/>
+        </w:tblBorders>
+      </w:tblPr>
+      <w:tblGrid>
+        <w:gridCol w:w="2592"/>
+        <w:gridCol w:w="2592"/>
+        <w:gridCol w:w="2592"/>
+        <w:gridCol w:w="2592"/>
+      </w:tblGrid>
+      <w:tr>
+        <w:tc>
+          <w:tcPr>
+            <w:tcW w:type="dxa" w:w="7776"/>
+            <w:gridSpan w:val="3"/>
+            <w:shd w:val="clear" w:fill="4472C4"/>
+          </w:tcPr>
+          <w:p>
+            <w:r>
+              <w:rPr>
+                <w:rFonts w:ascii="Arial" w:hAnsi="Arial"/>
+                <w:b/>
+                <w:i w:val="0"/>
+                <w:color w:val="FFFFFF"/>
+                <w:sz w:val="26"/>
+              </w:rPr>
+              <w:t xml:space="preserve">  Ondina Vasquell</w:t>
+            </w:r>
+            <w:r>
+              <w:rPr>
+                <w:rFonts w:ascii="Arial" w:hAnsi="Arial"/>
+                <w:b w:val="0"/>
+                <w:i w:val="0"/>
+                <w:color w:val="FFFFFF"/>
+                <w:sz w:val="18"/>
+              </w:rPr>
+              <w:t xml:space="preserve">    68 y  |  Female  |  DOB 03/14/1958</w:t>
+            </w:r>
+          </w:p>
+        </w:tc>
+        <w:tc>
+          <w:tcPr>
+            <w:tcW w:type="dxa" w:w="2592"/>
+            <w:shd w:val="clear" w:fill="4472C4"/>
+          </w:tcPr>
+          <w:p>
+            <w:pPr>
+              <w:jc w:val="right"/>
+            </w:pPr>
+            <w:r>
+              <w:rPr>
+                <w:rFonts w:ascii="Arial" w:hAnsi="Arial"/>
+                <w:b/>
+                <w:i w:val="0"/>
+                <w:color w:val="FFFFFF"/>
+                <w:sz w:val="20"/>
+              </w:rPr>
+              <w:t xml:space="preserve">MRN OV-3358104  </w:t>
+            </w:r>
+          </w:p>
+        </w:tc>
+      </w:tr>
+      <w:tr>
+        <w:tc>
+          <w:tcPr>
+            <w:tcW w:type="dxa" w:w="2592"/>
+            <w:shd w:val="clear" w:fill="EDF2FA"/>
+          </w:tcPr>
+          <w:p>
+            <w:r>
+              <w:rPr>
+                <w:rFonts w:ascii="Arial" w:hAnsi="Arial"/>
+                <w:b/>
+                <w:i w:val="0"/>
+                <w:color w:val="5E6670"/>
+                <w:sz w:val="14"/>
+              </w:rPr>
+              <w:t>Date of Service</w:t>
+              <w:br/>
+            </w:r>
+            <w:r>
+              <w:rPr>
+                <w:rFonts w:ascii="Arial" w:hAnsi="Arial"/>
+                <w:b w:val="0"/>
+                <w:i w:val="0"/>
+                <w:color w:val="232830"/>
+                <w:sz w:val="16"/>
+              </w:rPr>
+              <w:t>05/22/2026</w:t>
+            </w:r>
+          </w:p>
+        </w:tc>
+        <w:tc>
+          <w:tcPr>
+            <w:tcW w:type="dxa" w:w="2592"/>
+            <w:shd w:val="clear" w:fill="EDF2FA"/>
+          </w:tcPr>
+          <w:p>
+            <w:r>
+              <w:rPr>
+                <w:rFonts w:ascii="Arial" w:hAnsi="Arial"/>
+                <w:b/>
+                <w:i w:val="0"/>
+                <w:color w:val="5E6670"/>
+                <w:sz w:val="14"/>
+              </w:rPr>
+              <w:t>Author</w:t>
+              <w:br/>
+            </w:r>
+            <w:r>
+              <w:rPr>
+                <w:rFonts w:ascii="Arial" w:hAnsi="Arial"/>
+                <w:b w:val="0"/>
+                <w:i w:val="0"/>
+                <w:color w:val="232830"/>
+                <w:sz w:val="16"/>
+              </w:rPr>
+              <w:t>Mara Olarte, RN</w:t>
+            </w:r>
+          </w:p>
+        </w:tc>
+        <w:tc>
+          <w:tcPr>
+            <w:tcW w:type="dxa" w:w="2592"/>
+            <w:shd w:val="clear" w:fill="EDF2FA"/>
+          </w:tcPr>
+          <w:p>
+            <w:r>
+              <w:rPr>
+                <w:rFonts w:ascii="Arial" w:hAnsi="Arial"/>
+                <w:b/>
+                <w:i w:val="0"/>
+                <w:color w:val="5E6670"/>
+                <w:sz w:val="14"/>
+              </w:rPr>
+              <w:t>Allergies</w:t>
+              <w:br/>
+            </w:r>
+            <w:r>
+              <w:rPr>
+                <w:rFonts w:ascii="Arial" w:hAnsi="Arial"/>
+                <w:b w:val="0"/>
+                <w:i w:val="0"/>
+                <w:color w:val="232830"/>
+                <w:sz w:val="16"/>
+              </w:rPr>
+              <w:t>Sulfa (sulfonamide antibiotics) - rash</w:t>
+            </w:r>
+          </w:p>
+        </w:tc>
+        <w:tc>
+          <w:tcPr>
+            <w:tcW w:type="dxa" w:w="2592"/>
+            <w:shd w:val="clear" w:fill="EDF2FA"/>
+          </w:tcPr>
+          <w:p>
+            <w:r>
+              <w:rPr>
+                <w:rFonts w:ascii="Arial" w:hAnsi="Arial"/>
+                <w:b/>
+                <w:i w:val="0"/>
+                <w:color w:val="5E6670"/>
+                <w:sz w:val="14"/>
+              </w:rPr>
+              <w:t>Document</w:t>
+              <w:br/>
+            </w:r>
+            <w:r>
+              <w:rPr>
+                <w:rFonts w:ascii="Arial" w:hAnsi="Arial"/>
+                <w:b w:val="0"/>
+                <w:i w:val="0"/>
+                <w:color w:val="232830"/>
+                <w:sz w:val="16"/>
+              </w:rPr>
+              <w:t>CONCURRENT STAY REVIEW</w:t>
+            </w:r>
+          </w:p>
+        </w:tc>
+      </w:tr>
+    </w:tbl>
+    <w:p/>
     <w:p>
-      <w:pPr>
-        <w:spacing w:after="40" w:before="0"/>
-      </w:pPr>
       <w:r>
         <w:rPr>
-          <w:rFonts w:ascii="Calibri" w:hAnsi="Calibri"/>
+          <w:rFonts w:ascii="Arial" w:hAnsi="Arial"/>
           <w:b/>
-          <w:color w:val="1F3A5F"/>
-          <w:sz w:val="26"/>
+          <w:i w:val="0"/>
+          <w:color w:val="1F3864"/>
+          <w:sz w:val="28"/>
         </w:rPr>
-        <w:t>Harbor Crest Regional Medical Center</w:t>
+        <w:t>CONCURRENT STAY REVIEW - CONTINUED-STAY AND DISCHARGE READINESS</w:t>
+      </w:r>
+    </w:p>
+    <w:p>
+      <w:r>
+        <w:rPr>
+          <w:rFonts w:ascii="Arial" w:hAnsi="Arial"/>
+          <w:b w:val="0"/>
+          <w:i w:val="0"/>
+          <w:color w:val="5E6670"/>
+          <w:sz w:val="16"/>
+        </w:rPr>
+        <w:t>Author: Mara Olarte, RN - Utilization Review | Date of Service: 05/22/2026 | Status: Final for payer submission</w:t>
       </w:r>
     </w:p>
     <w:p>
       <w:pPr>
-        <w:spacing w:after="40" w:before="0"/>
+        <w:spacing w:before="180" w:after="60"/>
+        <w:pBdr>
+          <w:bottom w:val="single" w:sz="6" w:color="C9D4EA" w:space="2"/>
+        </w:pBdr>
       </w:pPr>
       <w:r>
         <w:rPr>
-          <w:rFonts w:ascii="Calibri" w:hAnsi="Calibri"/>
+          <w:rFonts w:ascii="Arial" w:hAnsi="Arial"/>
           <w:b/>
-          <w:color w:val="1F3A5F"/>
-          <w:sz w:val="20"/>
-        </w:rPr>
-        <w:t>Utilization Review / Care Management</w:t>
-      </w:r>
-    </w:p>
-    <w:p>
-      <w:pPr>
-        <w:spacing w:after="120" w:before="0"/>
-      </w:pPr>
-      <w:r>
-        <w:rPr>
-          <w:rFonts w:ascii="Calibri" w:hAnsi="Calibri"/>
-          <w:b w:val="0"/>
-          <w:color w:val="808080"/>
-          <w:sz w:val="16"/>
-        </w:rPr>
-        <w:t>Confidential</w:t>
-      </w:r>
-    </w:p>
-    <w:p>
-      <w:pPr>
-        <w:spacing w:after="40" w:before="0"/>
-      </w:pPr>
-      <w:r>
-        <w:rPr>
-          <w:rFonts w:ascii="Calibri" w:hAnsi="Calibri"/>
-          <w:b/>
-          <w:sz w:val="20"/>
-        </w:rPr>
-        <w:t>Ondina Vasquell    68 y  |  Female  |  DOB 03/14/1958</w:t>
-      </w:r>
-    </w:p>
-    <w:p>
-      <w:pPr>
-        <w:spacing w:after="40" w:before="0"/>
-      </w:pPr>
-      <w:r>
-        <w:rPr>
-          <w:rFonts w:ascii="Calibri" w:hAnsi="Calibri"/>
-          <w:b w:val="0"/>
-          <w:color w:val="555555"/>
-          <w:sz w:val="18"/>
-        </w:rPr>
-        <w:t>MRN OV-3358104</w:t>
-      </w:r>
-    </w:p>
-    <w:p>
-      <w:pPr>
-        <w:spacing w:after="40" w:before="0"/>
-      </w:pPr>
-      <w:r>
-        <w:rPr>
-          <w:rFonts w:ascii="Calibri" w:hAnsi="Calibri"/>
-          <w:b w:val="0"/>
-          <w:color w:val="555555"/>
-          <w:sz w:val="18"/>
-        </w:rPr>
-        <w:t>Date of Service 05/22/2026</w:t>
-      </w:r>
-    </w:p>
-    <w:p>
-      <w:pPr>
-        <w:spacing w:after="40" w:before="0"/>
-      </w:pPr>
-      <w:r>
-        <w:rPr>
-          <w:rFonts w:ascii="Calibri" w:hAnsi="Calibri"/>
-          <w:b w:val="0"/>
-          <w:color w:val="555555"/>
-          <w:sz w:val="18"/>
-        </w:rPr>
-        <w:t>Author Utilization Review</w:t>
-      </w:r>
-    </w:p>
-    <w:p>
-      <w:pPr>
-        <w:spacing w:after="40" w:before="0"/>
-      </w:pPr>
-      <w:r>
-        <w:rPr>
-          <w:rFonts w:ascii="Calibri" w:hAnsi="Calibri"/>
-          <w:b w:val="0"/>
-          <w:color w:val="555555"/>
-          <w:sz w:val="18"/>
-        </w:rPr>
-        <w:t>Allergies Sulfa (sulfonamide antibiotics) - rash</w:t>
-      </w:r>
-    </w:p>
-    <w:p>
-      <w:pPr>
-        <w:spacing w:after="160" w:before="0"/>
-      </w:pPr>
-      <w:r>
-        <w:rPr>
-          <w:rFonts w:ascii="Calibri" w:hAnsi="Calibri"/>
-          <w:b w:val="0"/>
-          <w:color w:val="555555"/>
-          <w:sz w:val="18"/>
-        </w:rPr>
-        <w:t>Document CONCURRENT STAY REVIEW</w:t>
-      </w:r>
-    </w:p>
-    <w:p>
-      <w:pPr>
-        <w:spacing w:after="40" w:before="0"/>
-      </w:pPr>
-      <w:r>
-        <w:rPr>
-          <w:rFonts w:ascii="Calibri" w:hAnsi="Calibri"/>
-          <w:b/>
-          <w:sz w:val="24"/>
-        </w:rPr>
-        <w:t>CONCURRENT STAY REVIEW - Continued-Stay and Discharge Readiness</w:t>
-      </w:r>
-    </w:p>
-    <w:p>
-      <w:pPr>
-        <w:spacing w:after="160" w:before="0"/>
-      </w:pPr>
-      <w:r>
-        <w:rPr>
-          <w:rFonts w:ascii="Calibri" w:hAnsi="Calibri"/>
-          <w:b w:val="0"/>
-          <w:color w:val="555555"/>
-          <w:sz w:val="18"/>
-        </w:rPr>
-        <w:t>Author: M. Olarte, RN - Utilization Review (finalized) | Date of Service: 05/22/2026 | Status: Final for payer submission</w:t>
-      </w:r>
-    </w:p>
-    <w:p>
-      <w:pPr>
-        <w:spacing w:after="40" w:before="0"/>
-      </w:pPr>
-      <w:r>
-        <w:rPr>
-          <w:rFonts w:ascii="Calibri" w:hAnsi="Calibri"/>
-          <w:b/>
+          <w:i w:val="0"/>
+          <w:color w:val="4472C4"/>
           <w:sz w:val="20"/>
         </w:rPr>
         <w:t>PATIENT / ENCOUNTER</w:t>
       </w:r>
     </w:p>
     <w:p>
-      <w:pPr>
-        <w:spacing w:after="20" w:before="0"/>
-      </w:pPr>
       <w:r>
         <w:rPr>
-          <w:rFonts w:ascii="Calibri" w:hAnsi="Calibri"/>
+          <w:rFonts w:ascii="Arial" w:hAnsi="Arial"/>
           <w:b/>
+          <w:i w:val="0"/>
+          <w:color w:val="232830"/>
           <w:sz w:val="18"/>
         </w:rPr>
         <w:t xml:space="preserve">Patient: </w:t>
       </w:r>
       <w:r>
         <w:rPr>
-          <w:rFonts w:ascii="Calibri" w:hAnsi="Calibri"/>
+          <w:rFonts w:ascii="Arial" w:hAnsi="Arial"/>
           <w:b w:val="0"/>
+          <w:i w:val="0"/>
+          <w:color w:val="232830"/>
           <w:sz w:val="18"/>
         </w:rPr>
         <w:t>Ondina Vasquell, 68 y</w:t>
       </w:r>
     </w:p>
     <w:p>
-      <w:pPr>
-        <w:spacing w:after="20" w:before="0"/>
-      </w:pPr>
       <w:r>
         <w:rPr>
-          <w:rFonts w:ascii="Calibri" w:hAnsi="Calibri"/>
+          <w:rFonts w:ascii="Arial" w:hAnsi="Arial"/>
           <w:b/>
+          <w:i w:val="0"/>
+          <w:color w:val="232830"/>
           <w:sz w:val="18"/>
         </w:rPr>
         <w:t xml:space="preserve">Sex / DOB: </w:t>
       </w:r>
       <w:r>
         <w:rPr>
-          <w:rFonts w:ascii="Calibri" w:hAnsi="Calibri"/>
+          <w:rFonts w:ascii="Arial" w:hAnsi="Arial"/>
           <w:b w:val="0"/>
+          <w:i w:val="0"/>
+          <w:color w:val="232830"/>
           <w:sz w:val="18"/>
         </w:rPr>
         <w:t>Female / 03/14/1958</w:t>
       </w:r>
     </w:p>
     <w:p>
-      <w:pPr>
-        <w:spacing w:after="20" w:before="0"/>
-      </w:pPr>
       <w:r>
         <w:rPr>
-          <w:rFonts w:ascii="Calibri" w:hAnsi="Calibri"/>
+          <w:rFonts w:ascii="Arial" w:hAnsi="Arial"/>
           <w:b/>
+          <w:i w:val="0"/>
+          <w:color w:val="232830"/>
           <w:sz w:val="18"/>
         </w:rPr>
         <w:t xml:space="preserve">MRN / FIN: </w:t>
       </w:r>
       <w:r>
         <w:rPr>
-          <w:rFonts w:ascii="Calibri" w:hAnsi="Calibri"/>
+          <w:rFonts w:ascii="Arial" w:hAnsi="Arial"/>
           <w:b w:val="0"/>
+          <w:i w:val="0"/>
+          <w:color w:val="232830"/>
           <w:sz w:val="18"/>
         </w:rPr>
         <w:t>OV-3358104 / FIN-2207733</w:t>
       </w:r>
     </w:p>
     <w:p>
-      <w:pPr>
-        <w:spacing w:after="20" w:before="0"/>
-      </w:pPr>
       <w:r>
         <w:rPr>
-          <w:rFonts w:ascii="Calibri" w:hAnsi="Calibri"/>
+          <w:rFonts w:ascii="Arial" w:hAnsi="Arial"/>
           <w:b/>
+          <w:i w:val="0"/>
+          <w:color w:val="232830"/>
           <w:sz w:val="18"/>
         </w:rPr>
         <w:t xml:space="preserve">Unit / Room: </w:t>
       </w:r>
       <w:r>
         <w:rPr>
-          <w:rFonts w:ascii="Calibri" w:hAnsi="Calibri"/>
+          <w:rFonts w:ascii="Arial" w:hAnsi="Arial"/>
           <w:b w:val="0"/>
+          <w:i w:val="0"/>
+          <w:color w:val="232830"/>
           <w:sz w:val="18"/>
         </w:rPr>
         <w:t>6 South Medicine / 6S-214</w:t>
       </w:r>
     </w:p>
     <w:p>
-      <w:pPr>
-        <w:spacing w:after="20" w:before="0"/>
-      </w:pPr>
       <w:r>
         <w:rPr>
-          <w:rFonts w:ascii="Calibri" w:hAnsi="Calibri"/>
+          <w:rFonts w:ascii="Arial" w:hAnsi="Arial"/>
           <w:b/>
+          <w:i w:val="0"/>
+          <w:color w:val="232830"/>
           <w:sz w:val="18"/>
         </w:rPr>
         <w:t xml:space="preserve">Code Status: </w:t>
       </w:r>
       <w:r>
         <w:rPr>
-          <w:rFonts w:ascii="Calibri" w:hAnsi="Calibri"/>
+          <w:rFonts w:ascii="Arial" w:hAnsi="Arial"/>
           <w:b w:val="0"/>
+          <w:i w:val="0"/>
+          <w:color w:val="232830"/>
           <w:sz w:val="18"/>
         </w:rPr>
         <w:t>Full Code</w:t>
       </w:r>
     </w:p>
     <w:p>
-      <w:pPr>
-        <w:spacing w:after="20" w:before="0"/>
-      </w:pPr>
       <w:r>
         <w:rPr>
-          <w:rFonts w:ascii="Calibri" w:hAnsi="Calibri"/>
+          <w:rFonts w:ascii="Arial" w:hAnsi="Arial"/>
           <w:b/>
+          <w:i w:val="0"/>
+          <w:color w:val="232830"/>
           <w:sz w:val="18"/>
         </w:rPr>
         <w:t xml:space="preserve">Allergies: </w:t>
       </w:r>
       <w:r>
         <w:rPr>
-          <w:rFonts w:ascii="Calibri" w:hAnsi="Calibri"/>
+          <w:rFonts w:ascii="Arial" w:hAnsi="Arial"/>
           <w:b w:val="0"/>
+          <w:i w:val="0"/>
+          <w:color w:val="232830"/>
           <w:sz w:val="18"/>
         </w:rPr>
         <w:t>Sulfa (sulfonamide antibiotics) - rash</w:t>
       </w:r>
     </w:p>
     <w:p>
-      <w:pPr>
-        <w:spacing w:after="20" w:before="0"/>
-      </w:pPr>
       <w:r>
         <w:rPr>
-          <w:rFonts w:ascii="Calibri" w:hAnsi="Calibri"/>
+          <w:rFonts w:ascii="Arial" w:hAnsi="Arial"/>
           <w:b/>
+          <w:i w:val="0"/>
+          <w:color w:val="232830"/>
           <w:sz w:val="18"/>
         </w:rPr>
         <w:t xml:space="preserve">Attending: </w:t>
       </w:r>
       <w:r>
         <w:rPr>
-          <w:rFonts w:ascii="Calibri" w:hAnsi="Calibri"/>
+          <w:rFonts w:ascii="Arial" w:hAnsi="Arial"/>
           <w:b w:val="0"/>
+          <w:i w:val="0"/>
+          <w:color w:val="232830"/>
           <w:sz w:val="18"/>
         </w:rPr>
         <w:t>Lillian Everet, MD</w:t>
       </w:r>
     </w:p>
     <w:p>
-      <w:pPr>
-        <w:spacing w:after="20" w:before="0"/>
-      </w:pPr>
       <w:r>
         <w:rPr>
-          <w:rFonts w:ascii="Calibri" w:hAnsi="Calibri"/>
+          <w:rFonts w:ascii="Arial" w:hAnsi="Arial"/>
           <w:b/>
+          <w:i w:val="0"/>
+          <w:color w:val="232830"/>
           <w:sz w:val="18"/>
         </w:rPr>
         <w:t xml:space="preserve">Service: </w:t>
       </w:r>
       <w:r>
         <w:rPr>
-          <w:rFonts w:ascii="Calibri" w:hAnsi="Calibri"/>
+          <w:rFonts w:ascii="Arial" w:hAnsi="Arial"/>
           <w:b w:val="0"/>
+          <w:i w:val="0"/>
+          <w:color w:val="232830"/>
           <w:sz w:val="18"/>
         </w:rPr>
         <w:t>Hospital Medicine</w:t>
       </w:r>
     </w:p>
     <w:p>
-      <w:pPr>
-        <w:spacing w:after="20" w:before="0"/>
-      </w:pPr>
       <w:r>
         <w:rPr>
-          <w:rFonts w:ascii="Calibri" w:hAnsi="Calibri"/>
+          <w:rFonts w:ascii="Arial" w:hAnsi="Arial"/>
           <w:b/>
+          <w:i w:val="0"/>
+          <w:color w:val="232830"/>
           <w:sz w:val="18"/>
         </w:rPr>
-        <w:t xml:space="preserve">Admission: </w:t>
+        <w:t xml:space="preserve">Date of Service: </w:t>
       </w:r>
       <w:r>
         <w:rPr>
-          <w:rFonts w:ascii="Calibri" w:hAnsi="Calibri"/>
+          <w:rFonts w:ascii="Arial" w:hAnsi="Arial"/>
           <w:b w:val="0"/>
+          <w:i w:val="0"/>
+          <w:color w:val="232830"/>
           <w:sz w:val="18"/>
         </w:rPr>
-        <w:t>05/16/2026 | Hospital Day 7</w:t>
+        <w:t>05/22/2026</w:t>
       </w:r>
     </w:p>
     <w:p>
-      <w:pPr>
-        <w:spacing w:after="20" w:before="0"/>
-      </w:pPr>
       <w:r>
         <w:rPr>
-          <w:rFonts w:ascii="Calibri" w:hAnsi="Calibri"/>
+          <w:rFonts w:ascii="Arial" w:hAnsi="Arial"/>
           <w:b/>
-          <w:sz w:val="18"/>
-        </w:rPr>
-        <w:t xml:space="preserve">Level of Care: </w:t>
-      </w:r>
-      <w:r>
-        <w:rPr>
-          <w:rFonts w:ascii="Calibri" w:hAnsi="Calibri"/>
-          <w:b w:val="0"/>
-          <w:sz w:val="18"/>
-        </w:rPr>
-        <w:t>Acute inpatient</w:t>
-      </w:r>
-    </w:p>
-    <w:p>
-      <w:pPr>
-        <w:spacing w:after="20" w:before="0"/>
-      </w:pPr>
-      <w:r>
-        <w:rPr>
-          <w:rFonts w:ascii="Calibri" w:hAnsi="Calibri"/>
-          <w:b/>
-          <w:sz w:val="18"/>
-        </w:rPr>
-        <w:t xml:space="preserve">Payer: </w:t>
-      </w:r>
-      <w:r>
-        <w:rPr>
-          <w:rFonts w:ascii="Calibri" w:hAnsi="Calibri"/>
-          <w:b w:val="0"/>
-          <w:sz w:val="18"/>
-        </w:rPr>
-        <w:t>Medicare Advantage (primary), Medicaid (secondary)</w:t>
-      </w:r>
-    </w:p>
-    <w:p>
-      <w:pPr>
-        <w:spacing w:after="20" w:before="0"/>
-      </w:pPr>
-      <w:r>
-        <w:rPr>
-          <w:rFonts w:ascii="Calibri" w:hAnsi="Calibri"/>
-          <w:b/>
+          <w:i w:val="0"/>
+          <w:color w:val="232830"/>
           <w:sz w:val="18"/>
         </w:rPr>
         <w:t xml:space="preserve">Language: </w:t>
       </w:r>
       <w:r>
         <w:rPr>
-          <w:rFonts w:ascii="Calibri" w:hAnsi="Calibri"/>
+          <w:rFonts w:ascii="Arial" w:hAnsi="Arial"/>
           <w:b w:val="0"/>
+          <w:i w:val="0"/>
+          <w:color w:val="232830"/>
           <w:sz w:val="18"/>
         </w:rPr>
         <w:t>Spanish preferred (interpreter used)</w:t>
@@ -421,98 +555,125 @@
     </w:p>
     <w:p>
       <w:pPr>
-        <w:spacing w:after="40"/>
-      </w:pPr>
-    </w:p>
-    <w:p>
-      <w:pPr>
-        <w:spacing w:after="40" w:before="0"/>
+        <w:spacing w:before="180" w:after="60"/>
+        <w:pBdr>
+          <w:bottom w:val="single" w:sz="6" w:color="C9D4EA" w:space="2"/>
+        </w:pBdr>
       </w:pPr>
       <w:r>
         <w:rPr>
-          <w:rFonts w:ascii="Calibri" w:hAnsi="Calibri"/>
+          <w:rFonts w:ascii="Arial" w:hAnsi="Arial"/>
           <w:b/>
+          <w:i w:val="0"/>
+          <w:color w:val="4472C4"/>
           <w:sz w:val="20"/>
         </w:rPr>
         <w:t>REASON FOR REVIEW</w:t>
       </w:r>
     </w:p>
     <w:p>
-      <w:pPr>
-        <w:spacing w:after="120" w:before="0"/>
-      </w:pPr>
       <w:r>
         <w:rPr>
-          <w:rFonts w:ascii="Calibri" w:hAnsi="Calibri"/>
+          <w:rFonts w:ascii="Arial" w:hAnsi="Arial"/>
           <w:b w:val="0"/>
-          <w:sz w:val="20"/>
+          <w:i w:val="0"/>
+          <w:color w:val="232830"/>
+          <w:sz w:val="19"/>
         </w:rPr>
         <w:t>Concurrent utilization review of continued inpatient stay for a treated limb-threatening left diabetic foot infection. This review supports the payer continued-stay determination and discharge planning.</w:t>
       </w:r>
     </w:p>
     <w:p>
-      <w:pPr>
-        <w:spacing w:after="40" w:before="0"/>
-      </w:pPr>
       <w:r>
         <w:rPr>
-          <w:rFonts w:ascii="Calibri" w:hAnsi="Calibri"/>
-          <w:b/>
-          <w:sz w:val="20"/>
+          <w:rFonts w:ascii="Arial" w:hAnsi="Arial"/>
+          <w:b w:val="0"/>
+          <w:i w:val="0"/>
+          <w:color w:val="232830"/>
+          <w:sz w:val="19"/>
         </w:rPr>
-        <w:t>INTERVAL SUMMARY (HD6 to HD7)</w:t>
+        <w:t>Admission 05/16/2026, hospital day 7. Level of care: acute inpatient. Payer: Medicare Advantage (primary), Medicaid (secondary).</w:t>
       </w:r>
     </w:p>
     <w:p>
       <w:pPr>
-        <w:spacing w:after="120" w:before="0"/>
+        <w:spacing w:before="180" w:after="60"/>
+        <w:pBdr>
+          <w:bottom w:val="single" w:sz="6" w:color="C9D4EA" w:space="2"/>
+        </w:pBdr>
       </w:pPr>
       <w:r>
         <w:rPr>
-          <w:rFonts w:ascii="Calibri" w:hAnsi="Calibri"/>
-          <w:b w:val="0"/>
+          <w:rFonts w:ascii="Arial" w:hAnsi="Arial"/>
+          <w:b/>
+          <w:i w:val="0"/>
+          <w:color w:val="4472C4"/>
           <w:sz w:val="20"/>
         </w:rPr>
-        <w:t>Continued clinical improvement. Afebrile and hemodynamically stable. WBC normalized at 8.9. Soft-tissue infection improving on culture-directed, renally dosed therapy. Surgical pathology 05/20 excluded osteomyelitis. Left forefoot wound granulating with scant drainage. Creatinine 1.6, near baseline 1.5. Patient feeling better and asking to go home.</w:t>
+        <w:t>INTERVAL SUMMARY (HD6 TO HD7)</w:t>
+      </w:r>
+    </w:p>
+    <w:p>
+      <w:r>
+        <w:rPr>
+          <w:rFonts w:ascii="Arial" w:hAnsi="Arial"/>
+          <w:b w:val="0"/>
+          <w:i w:val="0"/>
+          <w:color w:val="232830"/>
+          <w:sz w:val="19"/>
+        </w:rPr>
+        <w:t>Continued clinical improvement. Afebrile and hemodynamically stable. WBC normalized at 8.9. Soft-tissue infection improving on culture-directed, renally dosed therapy. Surgical pathology 05/20 excluded osteomyelitis (no bone in the specimen, no definitive features of osteomyelitis). Left forefoot wound granulating with scant drainage. Creatinine 1.6, near baseline 1.5. Patient feeling better and asking to go home.</w:t>
       </w:r>
     </w:p>
     <w:p>
       <w:pPr>
-        <w:spacing w:after="40" w:before="0"/>
+        <w:spacing w:before="180" w:after="60"/>
+        <w:pBdr>
+          <w:bottom w:val="single" w:sz="6" w:color="C9D4EA" w:space="2"/>
+        </w:pBdr>
       </w:pPr>
       <w:r>
         <w:rPr>
-          <w:rFonts w:ascii="Calibri" w:hAnsi="Calibri"/>
+          <w:rFonts w:ascii="Arial" w:hAnsi="Arial"/>
           <w:b/>
+          <w:i w:val="0"/>
+          <w:color w:val="4472C4"/>
           <w:sz w:val="20"/>
         </w:rPr>
-        <w:t>CRITERIA AND DISPOSITION TABLE</w:t>
+        <w:t>CRITERIA AND DISPOSITION</w:t>
       </w:r>
     </w:p>
     <w:tbl>
       <w:tblPr>
-        <w:tblStyle w:val="TableGrid"/>
         <w:tblW w:type="auto" w:w="0"/>
         <w:tblLook w:firstColumn="1" w:firstRow="1" w:lastColumn="0" w:lastRow="0" w:noHBand="0" w:noVBand="1" w:val="04A0"/>
+        <w:tblBorders>
+          <w:top w:val="single" w:sz="4" w:color="C9D4EA"/>
+          <w:left w:val="single" w:sz="4" w:color="C9D4EA"/>
+          <w:bottom w:val="single" w:sz="4" w:color="C9D4EA"/>
+          <w:right w:val="single" w:sz="4" w:color="C9D4EA"/>
+          <w:insideH w:val="single" w:sz="4" w:color="C9D4EA"/>
+          <w:insideV w:val="single" w:sz="4" w:color="C9D4EA"/>
+        </w:tblBorders>
       </w:tblPr>
       <w:tblGrid>
-        <w:gridCol w:w="4320"/>
-        <w:gridCol w:w="4320"/>
+        <w:gridCol w:w="5184"/>
+        <w:gridCol w:w="5184"/>
       </w:tblGrid>
       <w:tr>
         <w:tc>
           <w:tcPr>
-            <w:tcW w:type="dxa" w:w="3000"/>
+            <w:tcW w:type="dxa" w:w="5184"/>
+            <w:shd w:val="clear" w:fill="4472C4"/>
           </w:tcPr>
           <w:p>
-            <w:pPr>
-              <w:spacing w:after="20"/>
-            </w:pPr>
             <w:r>
               <w:rPr>
-                <w:rFonts w:ascii="Calibri" w:hAnsi="Calibri"/>
+                <w:rFonts w:ascii="Arial" w:hAnsi="Arial"/>
                 <w:b/>
-                <w:sz w:val="18"/>
+                <w:i w:val="0"/>
+                <w:color w:val="FFFFFF"/>
+                <w:sz w:val="16"/>
               </w:rPr>
               <w:t>Item</w:t>
             </w:r>
@@ -520,17 +681,17 @@
         </w:tc>
         <w:tc>
           <w:tcPr>
-            <w:tcW w:type="dxa" w:w="7200"/>
+            <w:tcW w:type="dxa" w:w="5184"/>
+            <w:shd w:val="clear" w:fill="4472C4"/>
           </w:tcPr>
           <w:p>
-            <w:pPr>
-              <w:spacing w:after="20"/>
-            </w:pPr>
             <w:r>
               <w:rPr>
-                <w:rFonts w:ascii="Calibri" w:hAnsi="Calibri"/>
+                <w:rFonts w:ascii="Arial" w:hAnsi="Arial"/>
                 <w:b/>
-                <w:sz w:val="18"/>
+                <w:i w:val="0"/>
+                <w:color w:val="FFFFFF"/>
+                <w:sz w:val="16"/>
               </w:rPr>
               <w:t>Status</w:t>
             </w:r>
@@ -540,17 +701,16 @@
       <w:tr>
         <w:tc>
           <w:tcPr>
-            <w:tcW w:type="dxa" w:w="3000"/>
+            <w:tcW w:type="dxa" w:w="5184"/>
           </w:tcPr>
           <w:p>
-            <w:pPr>
-              <w:spacing w:after="20"/>
-            </w:pPr>
             <w:r>
               <w:rPr>
-                <w:rFonts w:ascii="Calibri" w:hAnsi="Calibri"/>
-                <w:b/>
-                <w:sz w:val="18"/>
+                <w:rFonts w:ascii="Arial" w:hAnsi="Arial"/>
+                <w:b w:val="0"/>
+                <w:i w:val="0"/>
+                <w:color w:val="232830"/>
+                <w:sz w:val="16"/>
               </w:rPr>
               <w:t>Infection / source control</w:t>
             </w:r>
@@ -558,17 +718,16 @@
         </w:tc>
         <w:tc>
           <w:tcPr>
-            <w:tcW w:type="dxa" w:w="7200"/>
+            <w:tcW w:type="dxa" w:w="5184"/>
           </w:tcPr>
           <w:p>
-            <w:pPr>
-              <w:spacing w:after="20"/>
-            </w:pPr>
             <w:r>
               <w:rPr>
-                <w:rFonts w:ascii="Calibri" w:hAnsi="Calibri"/>
+                <w:rFonts w:ascii="Arial" w:hAnsi="Arial"/>
                 <w:b w:val="0"/>
-                <w:sz w:val="18"/>
+                <w:i w:val="0"/>
+                <w:color w:val="232830"/>
+                <w:sz w:val="16"/>
               </w:rPr>
               <w:t>Improving. Debrided HD2, granulating base, osteomyelitis excluded on pathology 05/20. Afebrile, WBC normalized.</w:t>
             </w:r>
@@ -578,17 +737,17 @@
       <w:tr>
         <w:tc>
           <w:tcPr>
-            <w:tcW w:type="dxa" w:w="3000"/>
+            <w:tcW w:type="dxa" w:w="5184"/>
+            <w:shd w:val="clear" w:fill="EDF2FA"/>
           </w:tcPr>
           <w:p>
-            <w:pPr>
-              <w:spacing w:after="20"/>
-            </w:pPr>
             <w:r>
               <w:rPr>
-                <w:rFonts w:ascii="Calibri" w:hAnsi="Calibri"/>
-                <w:b/>
-                <w:sz w:val="18"/>
+                <w:rFonts w:ascii="Arial" w:hAnsi="Arial"/>
+                <w:b w:val="0"/>
+                <w:i w:val="0"/>
+                <w:color w:val="232830"/>
+                <w:sz w:val="16"/>
               </w:rPr>
               <w:t>Antibiotics (discharge barrier)</w:t>
             </w:r>
@@ -596,17 +755,17 @@
         </w:tc>
         <w:tc>
           <w:tcPr>
-            <w:tcW w:type="dxa" w:w="7200"/>
+            <w:tcW w:type="dxa" w:w="5184"/>
+            <w:shd w:val="clear" w:fill="EDF2FA"/>
           </w:tcPr>
           <w:p>
-            <w:pPr>
-              <w:spacing w:after="20"/>
-            </w:pPr>
             <w:r>
               <w:rPr>
-                <w:rFonts w:ascii="Calibri" w:hAnsi="Calibri"/>
+                <w:rFonts w:ascii="Arial" w:hAnsi="Arial"/>
                 <w:b w:val="0"/>
-                <w:sz w:val="18"/>
+                <w:i w:val="0"/>
+                <w:color w:val="232830"/>
+                <w:sz w:val="16"/>
               </w:rPr>
               <w:t>Active parenteral therapy. Vancomycin, piperacillin-tazobactam, and cefepime IV, culture-directed and renally dosed, ongoing per the 05/21 MAR. No oral conversion is established: the documented sulfa allergy excludes trimethoprim-sulfamethoxazole despite susceptibility, and Infectious Disease has not finalized an oral regimen (the 05/19 plan note states it is not a final discharge antibiotic synthesis). No OPAT or home infusion is arranged. Home-health wound nursing does not administer intravenous antibiotics.</w:t>
             </w:r>
@@ -616,17 +775,16 @@
       <w:tr>
         <w:tc>
           <w:tcPr>
-            <w:tcW w:type="dxa" w:w="3000"/>
+            <w:tcW w:type="dxa" w:w="5184"/>
           </w:tcPr>
           <w:p>
-            <w:pPr>
-              <w:spacing w:after="20"/>
-            </w:pPr>
             <w:r>
               <w:rPr>
-                <w:rFonts w:ascii="Calibri" w:hAnsi="Calibri"/>
-                <w:b/>
-                <w:sz w:val="18"/>
+                <w:rFonts w:ascii="Arial" w:hAnsi="Arial"/>
+                <w:b w:val="0"/>
+                <w:i w:val="0"/>
+                <w:color w:val="232830"/>
+                <w:sz w:val="16"/>
               </w:rPr>
               <w:t>Perfusion</w:t>
             </w:r>
@@ -634,17 +792,16 @@
         </w:tc>
         <w:tc>
           <w:tcPr>
-            <w:tcW w:type="dxa" w:w="7200"/>
+            <w:tcW w:type="dxa" w:w="5184"/>
           </w:tcPr>
           <w:p>
-            <w:pPr>
-              <w:spacing w:after="20"/>
-            </w:pPr>
             <w:r>
               <w:rPr>
-                <w:rFonts w:ascii="Calibri" w:hAnsi="Calibri"/>
+                <w:rFonts w:ascii="Arial" w:hAnsi="Arial"/>
                 <w:b w:val="0"/>
-                <w:sz w:val="18"/>
+                <w:i w:val="0"/>
+                <w:color w:val="232830"/>
+                <w:sz w:val="16"/>
               </w:rPr>
               <w:t>Unresolved; reasonable to defer to outpatient vascular follow-up.</w:t>
             </w:r>
@@ -654,17 +811,17 @@
       <w:tr>
         <w:tc>
           <w:tcPr>
-            <w:tcW w:type="dxa" w:w="3000"/>
+            <w:tcW w:type="dxa" w:w="5184"/>
+            <w:shd w:val="clear" w:fill="EDF2FA"/>
           </w:tcPr>
           <w:p>
-            <w:pPr>
-              <w:spacing w:after="20"/>
-            </w:pPr>
             <w:r>
               <w:rPr>
-                <w:rFonts w:ascii="Calibri" w:hAnsi="Calibri"/>
-                <w:b/>
-                <w:sz w:val="18"/>
+                <w:rFonts w:ascii="Arial" w:hAnsi="Arial"/>
+                <w:b w:val="0"/>
+                <w:i w:val="0"/>
+                <w:color w:val="232830"/>
+                <w:sz w:val="16"/>
               </w:rPr>
               <w:t>Renal (AKI on CKD)</w:t>
             </w:r>
@@ -672,17 +829,17 @@
         </w:tc>
         <w:tc>
           <w:tcPr>
-            <w:tcW w:type="dxa" w:w="7200"/>
+            <w:tcW w:type="dxa" w:w="5184"/>
+            <w:shd w:val="clear" w:fill="EDF2FA"/>
           </w:tcPr>
           <w:p>
-            <w:pPr>
-              <w:spacing w:after="20"/>
-            </w:pPr>
             <w:r>
               <w:rPr>
-                <w:rFonts w:ascii="Calibri" w:hAnsi="Calibri"/>
+                <w:rFonts w:ascii="Arial" w:hAnsi="Arial"/>
                 <w:b w:val="0"/>
-                <w:sz w:val="18"/>
+                <w:i w:val="0"/>
+                <w:color w:val="232830"/>
+                <w:sz w:val="16"/>
               </w:rPr>
               <w:t>Improving and stable. Creatinine 1.6, near baseline 1.5. Held agents pending restart parameters.</w:t>
             </w:r>
@@ -692,17 +849,16 @@
       <w:tr>
         <w:tc>
           <w:tcPr>
-            <w:tcW w:type="dxa" w:w="3000"/>
+            <w:tcW w:type="dxa" w:w="5184"/>
           </w:tcPr>
           <w:p>
-            <w:pPr>
-              <w:spacing w:after="20"/>
-            </w:pPr>
             <w:r>
               <w:rPr>
-                <w:rFonts w:ascii="Calibri" w:hAnsi="Calibri"/>
-                <w:b/>
-                <w:sz w:val="18"/>
+                <w:rFonts w:ascii="Arial" w:hAnsi="Arial"/>
+                <w:b w:val="0"/>
+                <w:i w:val="0"/>
+                <w:color w:val="232830"/>
+                <w:sz w:val="16"/>
               </w:rPr>
               <w:t>Offloading / mobility</w:t>
             </w:r>
@@ -710,17 +866,16 @@
         </w:tc>
         <w:tc>
           <w:tcPr>
-            <w:tcW w:type="dxa" w:w="7200"/>
+            <w:tcW w:type="dxa" w:w="5184"/>
           </w:tcPr>
           <w:p>
-            <w:pPr>
-              <w:spacing w:after="20"/>
-            </w:pPr>
             <w:r>
               <w:rPr>
-                <w:rFonts w:ascii="Calibri" w:hAnsi="Calibri"/>
+                <w:rFonts w:ascii="Arial" w:hAnsi="Arial"/>
                 <w:b w:val="0"/>
-                <w:sz w:val="18"/>
+                <w:i w:val="0"/>
+                <w:color w:val="232830"/>
+                <w:sz w:val="16"/>
               </w:rPr>
               <w:t>Discharge planning in progress. Offloading device and stair clearance not yet completed.</w:t>
             </w:r>
@@ -730,17 +885,17 @@
       <w:tr>
         <w:tc>
           <w:tcPr>
-            <w:tcW w:type="dxa" w:w="3000"/>
+            <w:tcW w:type="dxa" w:w="5184"/>
+            <w:shd w:val="clear" w:fill="EDF2FA"/>
           </w:tcPr>
           <w:p>
-            <w:pPr>
-              <w:spacing w:after="20"/>
-            </w:pPr>
             <w:r>
               <w:rPr>
-                <w:rFonts w:ascii="Calibri" w:hAnsi="Calibri"/>
-                <w:b/>
-                <w:sz w:val="18"/>
+                <w:rFonts w:ascii="Arial" w:hAnsi="Arial"/>
+                <w:b w:val="0"/>
+                <w:i w:val="0"/>
+                <w:color w:val="232830"/>
+                <w:sz w:val="16"/>
               </w:rPr>
               <w:t>Home support</w:t>
             </w:r>
@@ -748,17 +903,17 @@
         </w:tc>
         <w:tc>
           <w:tcPr>
-            <w:tcW w:type="dxa" w:w="7200"/>
+            <w:tcW w:type="dxa" w:w="5184"/>
+            <w:shd w:val="clear" w:fill="EDF2FA"/>
           </w:tcPr>
           <w:p>
-            <w:pPr>
-              <w:spacing w:after="20"/>
-            </w:pPr>
             <w:r>
               <w:rPr>
-                <w:rFonts w:ascii="Calibri" w:hAnsi="Calibri"/>
+                <w:rFonts w:ascii="Arial" w:hAnsi="Arial"/>
                 <w:b w:val="0"/>
-                <w:sz w:val="18"/>
+                <w:i w:val="0"/>
+                <w:color w:val="232830"/>
+                <w:sz w:val="16"/>
               </w:rPr>
               <w:t>Discharge planning in progress. Home-health wound nursing referral placed; caregiver teaching not complete.</w:t>
             </w:r>
@@ -768,17 +923,16 @@
       <w:tr>
         <w:tc>
           <w:tcPr>
-            <w:tcW w:type="dxa" w:w="3000"/>
+            <w:tcW w:type="dxa" w:w="5184"/>
           </w:tcPr>
           <w:p>
-            <w:pPr>
-              <w:spacing w:after="20"/>
-            </w:pPr>
             <w:r>
               <w:rPr>
-                <w:rFonts w:ascii="Calibri" w:hAnsi="Calibri"/>
-                <w:b/>
-                <w:sz w:val="18"/>
+                <w:rFonts w:ascii="Arial" w:hAnsi="Arial"/>
+                <w:b w:val="0"/>
+                <w:i w:val="0"/>
+                <w:color w:val="232830"/>
+                <w:sz w:val="16"/>
               </w:rPr>
               <w:t>Follow-up</w:t>
             </w:r>
@@ -786,17 +940,16 @@
         </w:tc>
         <w:tc>
           <w:tcPr>
-            <w:tcW w:type="dxa" w:w="7200"/>
+            <w:tcW w:type="dxa" w:w="5184"/>
           </w:tcPr>
           <w:p>
-            <w:pPr>
-              <w:spacing w:after="20"/>
-            </w:pPr>
             <w:r>
               <w:rPr>
-                <w:rFonts w:ascii="Calibri" w:hAnsi="Calibri"/>
+                <w:rFonts w:ascii="Arial" w:hAnsi="Arial"/>
                 <w:b w:val="0"/>
-                <w:sz w:val="18"/>
+                <w:i w:val="0"/>
+                <w:color w:val="232830"/>
+                <w:sz w:val="16"/>
               </w:rPr>
               <w:t>Outpatient vascular, wound care, and primary care to be arranged.</w:t>
             </w:r>
@@ -804,97 +957,240 @@
         </w:tc>
       </w:tr>
     </w:tbl>
+    <w:p/>
     <w:p>
       <w:pPr>
-        <w:spacing w:after="40"/>
-      </w:pPr>
-    </w:p>
-    <w:p>
-      <w:pPr>
-        <w:spacing w:after="40" w:before="0"/>
+        <w:spacing w:before="180" w:after="60"/>
+        <w:pBdr>
+          <w:bottom w:val="single" w:sz="6" w:color="C9D4EA" w:space="2"/>
+        </w:pBdr>
       </w:pPr>
       <w:r>
         <w:rPr>
-          <w:rFonts w:ascii="Calibri" w:hAnsi="Calibri"/>
+          <w:rFonts w:ascii="Arial" w:hAnsi="Arial"/>
           <w:b/>
+          <w:i w:val="0"/>
+          <w:color w:val="4472C4"/>
           <w:sz w:val="20"/>
         </w:rPr>
         <w:t>DETERMINATION</w:t>
       </w:r>
     </w:p>
     <w:p>
-      <w:pPr>
-        <w:spacing w:after="120" w:before="0"/>
-      </w:pPr>
       <w:r>
         <w:rPr>
-          <w:rFonts w:ascii="Calibri" w:hAnsi="Calibri"/>
+          <w:rFonts w:ascii="Arial" w:hAnsi="Arial"/>
           <w:b w:val="0"/>
-          <w:sz w:val="20"/>
+          <w:i w:val="0"/>
+          <w:color w:val="232830"/>
+          <w:sz w:val="19"/>
         </w:rPr>
         <w:t>Continued acute inpatient stay is medically necessary. The patient does not meet criteria for discharge home today. The active intravenous antibiotic requirement for a limb-threatening diabetic foot infection has no established oral conversion (sulfa allergy) and no OPAT arranged, and home-health wound nursing cannot administer intravenous antibiotics. Discharge home today would interrupt antibiotic therapy and risk treatment failure, readmission, and limb loss.</w:t>
       </w:r>
     </w:p>
     <w:p>
       <w:pPr>
-        <w:spacing w:after="40" w:before="0"/>
+        <w:spacing w:before="180" w:after="60"/>
+        <w:pBdr>
+          <w:bottom w:val="single" w:sz="6" w:color="C9D4EA" w:space="2"/>
+        </w:pBdr>
       </w:pPr>
       <w:r>
         <w:rPr>
-          <w:rFonts w:ascii="Calibri" w:hAnsi="Calibri"/>
+          <w:rFonts w:ascii="Arial" w:hAnsi="Arial"/>
           <w:b/>
+          <w:i w:val="0"/>
+          <w:color w:val="4472C4"/>
           <w:sz w:val="20"/>
         </w:rPr>
         <w:t>PLAN TO CLEAR THE STAY</w:t>
       </w:r>
     </w:p>
     <w:p>
-      <w:pPr>
-        <w:spacing w:after="120" w:before="0"/>
-      </w:pPr>
       <w:r>
         <w:rPr>
-          <w:rFonts w:ascii="Calibri" w:hAnsi="Calibri"/>
+          <w:rFonts w:ascii="Arial" w:hAnsi="Arial"/>
           <w:b w:val="0"/>
-          <w:sz w:val="20"/>
+          <w:i w:val="0"/>
+          <w:color w:val="232830"/>
+          <w:sz w:val="19"/>
         </w:rPr>
         <w:t>Resolve the antibiotic route before discharge: establish a suitable oral regimen with Infectious Disease, accounting for the sulfa allergy and renal function, OR arrange a parenteral-capable level of care (OPAT or home infusion, or a skilled nursing facility) to complete the intravenous course. Complete offloading, stair clearance, and home-health setup in parallel. Re-review for discharge readiness when the antibiotic route and the home plan are confirmed.</w:t>
       </w:r>
     </w:p>
     <w:p>
       <w:pPr>
-        <w:spacing w:after="40" w:before="0"/>
+        <w:spacing w:before="180" w:after="60"/>
+        <w:pBdr>
+          <w:bottom w:val="single" w:sz="6" w:color="C9D4EA" w:space="2"/>
+        </w:pBdr>
       </w:pPr>
       <w:r>
         <w:rPr>
-          <w:rFonts w:ascii="Calibri" w:hAnsi="Calibri"/>
+          <w:rFonts w:ascii="Arial" w:hAnsi="Arial"/>
           <w:b/>
+          <w:i w:val="0"/>
+          <w:color w:val="4472C4"/>
           <w:sz w:val="20"/>
         </w:rPr>
         <w:t>DISPOSITION (FINAL)</w:t>
       </w:r>
     </w:p>
     <w:p>
-      <w:pPr>
-        <w:spacing w:after="120" w:before="0"/>
-      </w:pPr>
       <w:r>
         <w:rPr>
-          <w:rFonts w:ascii="Calibri" w:hAnsi="Calibri"/>
+          <w:rFonts w:ascii="Arial" w:hAnsi="Arial"/>
           <w:b w:val="0"/>
-          <w:sz w:val="20"/>
+          <w:i w:val="0"/>
+          <w:color w:val="232830"/>
+          <w:sz w:val="19"/>
         </w:rPr>
         <w:t>Continued inpatient stay certified as medically necessary on hospital day 7. Discharge home today is not supported. Discharge only once the antibiotic route is resolved and the home plan is confirmed, or transition to a skilled facility capable of completing parenteral therapy.</w:t>
       </w:r>
     </w:p>
+    <w:p>
+      <w:pPr>
+        <w:spacing w:before="200"/>
+        <w:pBdr>
+          <w:top w:val="single" w:sz="4" w:color="C9D4EA" w:space="4"/>
+        </w:pBdr>
+      </w:pPr>
+      <w:r>
+        <w:rPr>
+          <w:rFonts w:ascii="Arial" w:hAnsi="Arial"/>
+          <w:b w:val="0"/>
+          <w:i/>
+          <w:color w:val="5E6670"/>
+          <w:sz w:val="18"/>
+        </w:rPr>
+        <w:t>Mara Olarte, RN - Utilization Review, 05/22/2026. Final for submission.</w:t>
+      </w:r>
+    </w:p>
     <w:sectPr>
+      <w:headerReference w:type="default" r:id="rId9"/>
+      <w:footerReference w:type="default" r:id="rId10"/>
+      <w:headerReference w:type="even" r:id="rId11"/>
+      <w:footerReference w:type="even" r:id="rId12"/>
+      <w:headerReference w:type="first" r:id="rId13"/>
+      <w:footerReference w:type="first" r:id="rId14"/>
       <w:pgSz w:w="12240" w:h="15840"/>
-      <w:pgMar w:top="1440" w:right="1800" w:bottom="1440" w:left="1800" w:header="720" w:footer="720" w:gutter="0"/>
+      <w:pgMar w:top="720" w:right="936" w:bottom="792" w:left="936" w:header="720" w:footer="720" w:gutter="0"/>
       <w:cols w:space="720"/>
       <w:docGrid w:linePitch="360"/>
     </w:sectPr>
   </w:body>
 </w:document>
+</file>
+
+<file path=word/footer1.xml><?xml version="1.0" encoding="utf-8"?>
+<w:ftr xmlns:m="http://schemas.openxmlformats.org/officeDocument/2006/math" xmlns:mc="http://schemas.openxmlformats.org/markup-compatibility/2006" xmlns:mo="http://schemas.microsoft.com/office/mac/office/2008/main" xmlns:mv="urn:schemas-microsoft-com:mac:vml" xmlns:o="urn:schemas-microsoft-com:office:office" xmlns:r="http://schemas.openxmlformats.org/officeDocument/2006/relationships" xmlns:v="urn:schemas-microsoft-com:vml" xmlns:w10="urn:schemas-microsoft-com:office:word" xmlns:w14="http://schemas.microsoft.com/office/word/2010/wordml" xmlns:w="http://schemas.openxmlformats.org/wordprocessingml/2006/main" xmlns:wne="http://schemas.microsoft.com/office/word/2006/wordml" xmlns:wp14="http://schemas.microsoft.com/office/word/2010/wordprocessingDrawing" xmlns:wp="http://schemas.openxmlformats.org/drawingml/2006/wordprocessingDrawing" xmlns:wpc="http://schemas.microsoft.com/office/word/2010/wordprocessingCanvas" xmlns:wpg="http://schemas.microsoft.com/office/word/2010/wordprocessingGroup" xmlns:wpi="http://schemas.microsoft.com/office/word/2010/wordprocessingInk" xmlns:wps="http://schemas.microsoft.com/office/word/2010/wordprocessingShape" mc:Ignorable="w14 wp14">
+  <w:p>
+    <w:pPr>
+      <w:jc w:val="center"/>
+    </w:pPr>
+    <w:r>
+      <w:rPr>
+        <w:rFonts w:ascii="Arial" w:hAnsi="Arial"/>
+        <w:b w:val="0"/>
+        <w:i w:val="0"/>
+        <w:color w:val="5E6670"/>
+        <w:sz w:val="15"/>
+      </w:rPr>
+      <w:t>Harbor Crest Regional Medical Center  |  CONCURRENT STAY REVIEW  |  Confidential</w:t>
+    </w:r>
+  </w:p>
+</w:ftr>
+</file>
+
+<file path=word/footer2.xml><?xml version="1.0" encoding="utf-8"?>
+<w:ftr xmlns:m="http://schemas.openxmlformats.org/officeDocument/2006/math" xmlns:mc="http://schemas.openxmlformats.org/markup-compatibility/2006" xmlns:mo="http://schemas.microsoft.com/office/mac/office/2008/main" xmlns:mv="urn:schemas-microsoft-com:mac:vml" xmlns:o="urn:schemas-microsoft-com:office:office" xmlns:r="http://schemas.openxmlformats.org/officeDocument/2006/relationships" xmlns:v="urn:schemas-microsoft-com:vml" xmlns:w10="urn:schemas-microsoft-com:office:word" xmlns:w14="http://schemas.microsoft.com/office/word/2010/wordml" xmlns:w="http://schemas.openxmlformats.org/wordprocessingml/2006/main" xmlns:wne="http://schemas.microsoft.com/office/word/2006/wordml" xmlns:wp14="http://schemas.microsoft.com/office/word/2010/wordprocessingDrawing" xmlns:wp="http://schemas.openxmlformats.org/drawingml/2006/wordprocessingDrawing" xmlns:wpc="http://schemas.microsoft.com/office/word/2010/wordprocessingCanvas" xmlns:wpg="http://schemas.microsoft.com/office/word/2010/wordprocessingGroup" xmlns:wpi="http://schemas.microsoft.com/office/word/2010/wordprocessingInk" xmlns:wps="http://schemas.microsoft.com/office/word/2010/wordprocessingShape" mc:Ignorable="w14 wp14">
+  <w:p>
+    <w:pPr>
+      <w:jc w:val="center"/>
+    </w:pPr>
+    <w:r>
+      <w:rPr>
+        <w:rFonts w:ascii="Arial" w:hAnsi="Arial"/>
+        <w:b w:val="0"/>
+        <w:i w:val="0"/>
+        <w:color w:val="5E6670"/>
+        <w:sz w:val="15"/>
+      </w:rPr>
+      <w:t>Harbor Crest Regional Medical Center  |  CONCURRENT STAY REVIEW  |  Confidential</w:t>
+    </w:r>
+  </w:p>
+</w:ftr>
+</file>
+
+<file path=word/footer3.xml><?xml version="1.0" encoding="utf-8"?>
+<w:ftr xmlns:m="http://schemas.openxmlformats.org/officeDocument/2006/math" xmlns:mc="http://schemas.openxmlformats.org/markup-compatibility/2006" xmlns:mo="http://schemas.microsoft.com/office/mac/office/2008/main" xmlns:mv="urn:schemas-microsoft-com:mac:vml" xmlns:o="urn:schemas-microsoft-com:office:office" xmlns:r="http://schemas.openxmlformats.org/officeDocument/2006/relationships" xmlns:v="urn:schemas-microsoft-com:vml" xmlns:w10="urn:schemas-microsoft-com:office:word" xmlns:w14="http://schemas.microsoft.com/office/word/2010/wordml" xmlns:w="http://schemas.openxmlformats.org/wordprocessingml/2006/main" xmlns:wne="http://schemas.microsoft.com/office/word/2006/wordml" xmlns:wp14="http://schemas.microsoft.com/office/word/2010/wordprocessingDrawing" xmlns:wp="http://schemas.openxmlformats.org/drawingml/2006/wordprocessingDrawing" xmlns:wpc="http://schemas.microsoft.com/office/word/2010/wordprocessingCanvas" xmlns:wpg="http://schemas.microsoft.com/office/word/2010/wordprocessingGroup" xmlns:wpi="http://schemas.microsoft.com/office/word/2010/wordprocessingInk" xmlns:wps="http://schemas.microsoft.com/office/word/2010/wordprocessingShape" mc:Ignorable="w14 wp14">
+  <w:p>
+    <w:pPr>
+      <w:jc w:val="center"/>
+    </w:pPr>
+    <w:r>
+      <w:rPr>
+        <w:rFonts w:ascii="Arial" w:hAnsi="Arial"/>
+        <w:b w:val="0"/>
+        <w:i w:val="0"/>
+        <w:color w:val="5E6670"/>
+        <w:sz w:val="15"/>
+      </w:rPr>
+      <w:t>Harbor Crest Regional Medical Center  |  CONCURRENT STAY REVIEW  |  Confidential</w:t>
+    </w:r>
+  </w:p>
+</w:ftr>
+</file>
+
+<file path=word/header1.xml><?xml version="1.0" encoding="utf-8"?>
+<w:hdr xmlns:m="http://schemas.openxmlformats.org/officeDocument/2006/math" xmlns:mc="http://schemas.openxmlformats.org/markup-compatibility/2006" xmlns:mo="http://schemas.microsoft.com/office/mac/office/2008/main" xmlns:mv="urn:schemas-microsoft-com:mac:vml" xmlns:o="urn:schemas-microsoft-com:office:office" xmlns:r="http://schemas.openxmlformats.org/officeDocument/2006/relationships" xmlns:v="urn:schemas-microsoft-com:vml" xmlns:w10="urn:schemas-microsoft-com:office:word" xmlns:w14="http://schemas.microsoft.com/office/word/2010/wordml" xmlns:w="http://schemas.openxmlformats.org/wordprocessingml/2006/main" xmlns:wne="http://schemas.microsoft.com/office/word/2006/wordml" xmlns:wp14="http://schemas.microsoft.com/office/word/2010/wordprocessingDrawing" xmlns:wp="http://schemas.openxmlformats.org/drawingml/2006/wordprocessingDrawing" xmlns:wpc="http://schemas.microsoft.com/office/word/2010/wordprocessingCanvas" xmlns:wpg="http://schemas.microsoft.com/office/word/2010/wordprocessingGroup" xmlns:wpi="http://schemas.microsoft.com/office/word/2010/wordprocessingInk" xmlns:wps="http://schemas.microsoft.com/office/word/2010/wordprocessingShape" mc:Ignorable="w14 wp14">
+  <w:p>
+    <w:r>
+      <w:rPr>
+        <w:rFonts w:ascii="Arial" w:hAnsi="Arial"/>
+        <w:b w:val="0"/>
+        <w:i w:val="0"/>
+        <w:color w:val="5E6670"/>
+        <w:sz w:val="15"/>
+      </w:rPr>
+      <w:t>Ondina Vasquell  |  MRN OV-3358104</w:t>
+    </w:r>
+  </w:p>
+</w:hdr>
+</file>
+
+<file path=word/header2.xml><?xml version="1.0" encoding="utf-8"?>
+<w:hdr xmlns:m="http://schemas.openxmlformats.org/officeDocument/2006/math" xmlns:mc="http://schemas.openxmlformats.org/markup-compatibility/2006" xmlns:mo="http://schemas.microsoft.com/office/mac/office/2008/main" xmlns:mv="urn:schemas-microsoft-com:mac:vml" xmlns:o="urn:schemas-microsoft-com:office:office" xmlns:r="http://schemas.openxmlformats.org/officeDocument/2006/relationships" xmlns:v="urn:schemas-microsoft-com:vml" xmlns:w10="urn:schemas-microsoft-com:office:word" xmlns:w14="http://schemas.microsoft.com/office/word/2010/wordml" xmlns:w="http://schemas.openxmlformats.org/wordprocessingml/2006/main" xmlns:wne="http://schemas.microsoft.com/office/word/2006/wordml" xmlns:wp14="http://schemas.microsoft.com/office/word/2010/wordprocessingDrawing" xmlns:wp="http://schemas.openxmlformats.org/drawingml/2006/wordprocessingDrawing" xmlns:wpc="http://schemas.microsoft.com/office/word/2010/wordprocessingCanvas" xmlns:wpg="http://schemas.microsoft.com/office/word/2010/wordprocessingGroup" xmlns:wpi="http://schemas.microsoft.com/office/word/2010/wordprocessingInk" xmlns:wps="http://schemas.microsoft.com/office/word/2010/wordprocessingShape" mc:Ignorable="w14 wp14">
+  <w:p>
+    <w:r>
+      <w:rPr>
+        <w:rFonts w:ascii="Arial" w:hAnsi="Arial"/>
+        <w:b w:val="0"/>
+        <w:i w:val="0"/>
+        <w:color w:val="5E6670"/>
+        <w:sz w:val="15"/>
+      </w:rPr>
+      <w:t>Ondina Vasquell  |  MRN OV-3358104</w:t>
+    </w:r>
+  </w:p>
+</w:hdr>
+</file>
+
+<file path=word/header3.xml><?xml version="1.0" encoding="utf-8"?>
+<w:hdr xmlns:m="http://schemas.openxmlformats.org/officeDocument/2006/math" xmlns:mc="http://schemas.openxmlformats.org/markup-compatibility/2006" xmlns:mo="http://schemas.microsoft.com/office/mac/office/2008/main" xmlns:mv="urn:schemas-microsoft-com:mac:vml" xmlns:o="urn:schemas-microsoft-com:office:office" xmlns:r="http://schemas.openxmlformats.org/officeDocument/2006/relationships" xmlns:v="urn:schemas-microsoft-com:vml" xmlns:w10="urn:schemas-microsoft-com:office:word" xmlns:w14="http://schemas.microsoft.com/office/word/2010/wordml" xmlns:w="http://schemas.openxmlformats.org/wordprocessingml/2006/main" xmlns:wne="http://schemas.microsoft.com/office/word/2006/wordml" xmlns:wp14="http://schemas.microsoft.com/office/word/2010/wordprocessingDrawing" xmlns:wp="http://schemas.openxmlformats.org/drawingml/2006/wordprocessingDrawing" xmlns:wpc="http://schemas.microsoft.com/office/word/2010/wordprocessingCanvas" xmlns:wpg="http://schemas.microsoft.com/office/word/2010/wordprocessingGroup" xmlns:wpi="http://schemas.microsoft.com/office/word/2010/wordprocessingInk" xmlns:wps="http://schemas.microsoft.com/office/word/2010/wordprocessingShape" mc:Ignorable="w14 wp14">
+  <w:p>
+    <w:r>
+      <w:rPr>
+        <w:rFonts w:ascii="Arial" w:hAnsi="Arial"/>
+        <w:b w:val="0"/>
+        <w:i w:val="0"/>
+        <w:color w:val="5E6670"/>
+        <w:sz w:val="15"/>
+      </w:rPr>
+      <w:t>Ondina Vasquell  |  MRN OV-3358104</w:t>
+    </w:r>
+  </w:p>
+</w:hdr>
 </file>
 
 <file path=word/numbering.xml><?xml version="1.0" encoding="utf-8"?>
@@ -1260,6 +1556,10 @@
     <w:name w:val="Normal"/>
     <w:qFormat/>
     <w:rsid w:val="00FC693F"/>
+    <w:rPr>
+      <w:rFonts w:ascii="Arial" w:hAnsi="Arial"/>
+      <w:sz w:val="19"/>
+    </w:rPr>
   </w:style>
   <w:style w:type="paragraph" w:styleId="Header">
     <w:name w:val="header"/>

</xml_diff>

<commit_message>
OV08 v2: rebuild on the EXISTING continued-stay worksheet (task_data.T6) via the canonical task-file adapter; golden now catches the worksheet's antibiotic-route lie (transitioned-to-oral) as load-bearing; retire the invented concurrent-stay-review draft
</commit_message>
<xml_diff>
--- a/worlds/ondina-vasquell/phase-3-build-task-artifacts/platform/task8/current/golden-OV08-v1.docx
+++ b/worlds/ondina-vasquell/phase-3-build-task-artifacts/platform/task8/current/golden-OV08-v1.docx
@@ -34,18 +34,6 @@
                 <w:sz w:val="22"/>
               </w:rPr>
               <w:t>Harbor Crest Regional Medical Center</w:t>
-            </w:r>
-          </w:p>
-          <w:p>
-            <w:r>
-              <w:rPr>
-                <w:rFonts w:ascii="Arial" w:hAnsi="Arial"/>
-                <w:b w:val="0"/>
-                <w:i w:val="0"/>
-                <w:color w:val="5E6670"/>
-                <w:sz w:val="16"/>
-              </w:rPr>
-              <w:t>Utilization Review</w:t>
             </w:r>
           </w:p>
         </w:tc>
@@ -197,7 +185,7 @@
                 <w:color w:val="232830"/>
                 <w:sz w:val="16"/>
               </w:rPr>
-              <w:t>05/22/2026</w:t>
+              <w:t>05/26/2026</w:t>
             </w:r>
           </w:p>
         </w:tc>
@@ -226,7 +214,7 @@
                 <w:color w:val="232830"/>
                 <w:sz w:val="16"/>
               </w:rPr>
-              <w:t>Mara Olarte, RN</w:t>
+              <w:t>Physician Advisor, Utilization Review</w:t>
             </w:r>
           </w:p>
         </w:tc>
@@ -284,7 +272,7 @@
                 <w:color w:val="232830"/>
                 <w:sz w:val="16"/>
               </w:rPr>
-              <w:t>CONCURRENT STAY REVIEW</w:t>
+              <w:t>CONTINUED STAY DETERMINATION</w:t>
             </w:r>
           </w:p>
         </w:tc>
@@ -300,7 +288,7 @@
           <w:color w:val="1F3864"/>
           <w:sz w:val="28"/>
         </w:rPr>
-        <w:t>CONCURRENT STAY REVIEW - CONTINUED-STAY AND DISCHARGE READINESS</w:t>
+        <w:t>PHYSICIAN-ADVISOR CONTINUED-STAY DETERMINATION</w:t>
       </w:r>
     </w:p>
     <w:p>
@@ -312,7 +300,7 @@
           <w:color w:val="5E6670"/>
           <w:sz w:val="16"/>
         </w:rPr>
-        <w:t>Author: Mara Olarte, RN - Utilization Review | Date of Service: 05/22/2026 | Status: Final for payer submission</w:t>
+        <w:t>Author: Physician Advisor, Utilization Review | Date of Service: 05/26/2026 1100 | Status: Draft for physician sign</w:t>
       </w:r>
     </w:p>
     <w:p>
@@ -528,7 +516,7 @@
           <w:color w:val="232830"/>
           <w:sz w:val="18"/>
         </w:rPr>
-        <w:t>05/22/2026</w:t>
+        <w:t>05/26/2026</w:t>
       </w:r>
     </w:p>
     <w:p>
@@ -568,7 +556,7 @@
           <w:color w:val="4472C4"/>
           <w:sz w:val="20"/>
         </w:rPr>
-        <w:t>REASON FOR REVIEW</w:t>
+        <w:t>DETERMINATION</w:t>
       </w:r>
     </w:p>
     <w:p>
@@ -580,19 +568,7 @@
           <w:color w:val="232830"/>
           <w:sz w:val="19"/>
         </w:rPr>
-        <w:t>Concurrent utilization review of continued inpatient stay for a treated limb-threatening left diabetic foot infection. This review supports the payer continued-stay determination and discharge planning.</w:t>
-      </w:r>
-    </w:p>
-    <w:p>
-      <w:r>
-        <w:rPr>
-          <w:rFonts w:ascii="Arial" w:hAnsi="Arial"/>
-          <w:b w:val="0"/>
-          <w:i w:val="0"/>
-          <w:color w:val="232830"/>
-          <w:sz w:val="19"/>
-        </w:rPr>
-        <w:t>Admission 05/16/2026, hospital day 7. Level of care: acute inpatient. Payer: Medicare Advantage (primary), Medicaid (secondary).</w:t>
+        <w:t>I reviewed the first-level continued-stay worksheet. I do not adopt the preliminary lower-level determination. Continued facility-level or skilled-level care is justified as of 05/26/2026. The patient does not meet criteria for a safe step-down to an unsupported home setting.</w:t>
       </w:r>
     </w:p>
     <w:p>
@@ -610,7 +586,7 @@
           <w:color w:val="4472C4"/>
           <w:sz w:val="20"/>
         </w:rPr>
-        <w:t>INTERVAL SUMMARY (HD6 TO HD7)</w:t>
+        <w:t>LOAD-BEARING CORRECTION</w:t>
       </w:r>
     </w:p>
     <w:p>
@@ -622,7 +598,7 @@
           <w:color w:val="232830"/>
           <w:sz w:val="19"/>
         </w:rPr>
-        <w:t>Continued clinical improvement. Afebrile and hemodynamically stable. WBC normalized at 8.9. Soft-tissue infection improving on culture-directed, renally dosed therapy. Surgical pathology 05/20 excluded osteomyelitis (no bone in the specimen, no definitive features of osteomyelitis). Left forefoot wound granulating with scant drainage. Creatinine 1.6, near baseline 1.5. Patient feeling better and asking to go home.</w:t>
+        <w:t>The worksheet states the patient was transitioned to oral antibiotics. That is not supported. The medication record shows ongoing intravenous vancomycin, piperacillin-tazobactam, and cefepime through 05/21, and no oral regimen has been established. The documented sulfa allergy excludes trimethoprim-sulfamethoxazole despite susceptibility, and Infectious Disease has not finalized an oral step-down. The patient requires ongoing parenteral antibiotics for a limb-threatening infection, with no OPAT or home infusion arranged, and home-health wound nursing does not administer intravenous antibiotics. This alone makes discharge home unsafe and is the decisive error in the worksheet.</w:t>
       </w:r>
     </w:p>
     <w:p>
@@ -640,343 +616,14 @@
           <w:color w:val="4472C4"/>
           <w:sz w:val="20"/>
         </w:rPr>
-        <w:t>CRITERIA AND DISPOSITION</w:t>
-      </w:r>
-    </w:p>
-    <w:tbl>
-      <w:tblPr>
-        <w:tblW w:type="auto" w:w="0"/>
-        <w:tblLook w:firstColumn="1" w:firstRow="1" w:lastColumn="0" w:lastRow="0" w:noHBand="0" w:noVBand="1" w:val="04A0"/>
-        <w:tblBorders>
-          <w:top w:val="single" w:sz="4" w:color="C9D4EA"/>
-          <w:left w:val="single" w:sz="4" w:color="C9D4EA"/>
-          <w:bottom w:val="single" w:sz="4" w:color="C9D4EA"/>
-          <w:right w:val="single" w:sz="4" w:color="C9D4EA"/>
-          <w:insideH w:val="single" w:sz="4" w:color="C9D4EA"/>
-          <w:insideV w:val="single" w:sz="4" w:color="C9D4EA"/>
-        </w:tblBorders>
-      </w:tblPr>
-      <w:tblGrid>
-        <w:gridCol w:w="5184"/>
-        <w:gridCol w:w="5184"/>
-      </w:tblGrid>
-      <w:tr>
-        <w:tc>
-          <w:tcPr>
-            <w:tcW w:type="dxa" w:w="5184"/>
-            <w:shd w:val="clear" w:fill="4472C4"/>
-          </w:tcPr>
-          <w:p>
-            <w:r>
-              <w:rPr>
-                <w:rFonts w:ascii="Arial" w:hAnsi="Arial"/>
-                <w:b/>
-                <w:i w:val="0"/>
-                <w:color w:val="FFFFFF"/>
-                <w:sz w:val="16"/>
-              </w:rPr>
-              <w:t>Item</w:t>
-            </w:r>
-          </w:p>
-        </w:tc>
-        <w:tc>
-          <w:tcPr>
-            <w:tcW w:type="dxa" w:w="5184"/>
-            <w:shd w:val="clear" w:fill="4472C4"/>
-          </w:tcPr>
-          <w:p>
-            <w:r>
-              <w:rPr>
-                <w:rFonts w:ascii="Arial" w:hAnsi="Arial"/>
-                <w:b/>
-                <w:i w:val="0"/>
-                <w:color w:val="FFFFFF"/>
-                <w:sz w:val="16"/>
-              </w:rPr>
-              <w:t>Status</w:t>
-            </w:r>
-          </w:p>
-        </w:tc>
-      </w:tr>
-      <w:tr>
-        <w:tc>
-          <w:tcPr>
-            <w:tcW w:type="dxa" w:w="5184"/>
-          </w:tcPr>
-          <w:p>
-            <w:r>
-              <w:rPr>
-                <w:rFonts w:ascii="Arial" w:hAnsi="Arial"/>
-                <w:b w:val="0"/>
-                <w:i w:val="0"/>
-                <w:color w:val="232830"/>
-                <w:sz w:val="16"/>
-              </w:rPr>
-              <w:t>Infection / source control</w:t>
-            </w:r>
-          </w:p>
-        </w:tc>
-        <w:tc>
-          <w:tcPr>
-            <w:tcW w:type="dxa" w:w="5184"/>
-          </w:tcPr>
-          <w:p>
-            <w:r>
-              <w:rPr>
-                <w:rFonts w:ascii="Arial" w:hAnsi="Arial"/>
-                <w:b w:val="0"/>
-                <w:i w:val="0"/>
-                <w:color w:val="232830"/>
-                <w:sz w:val="16"/>
-              </w:rPr>
-              <w:t>Improving. Debrided HD2, granulating base, osteomyelitis excluded on pathology 05/20. Afebrile, WBC normalized.</w:t>
-            </w:r>
-          </w:p>
-        </w:tc>
-      </w:tr>
-      <w:tr>
-        <w:tc>
-          <w:tcPr>
-            <w:tcW w:type="dxa" w:w="5184"/>
-            <w:shd w:val="clear" w:fill="EDF2FA"/>
-          </w:tcPr>
-          <w:p>
-            <w:r>
-              <w:rPr>
-                <w:rFonts w:ascii="Arial" w:hAnsi="Arial"/>
-                <w:b w:val="0"/>
-                <w:i w:val="0"/>
-                <w:color w:val="232830"/>
-                <w:sz w:val="16"/>
-              </w:rPr>
-              <w:t>Antibiotics (discharge barrier)</w:t>
-            </w:r>
-          </w:p>
-        </w:tc>
-        <w:tc>
-          <w:tcPr>
-            <w:tcW w:type="dxa" w:w="5184"/>
-            <w:shd w:val="clear" w:fill="EDF2FA"/>
-          </w:tcPr>
-          <w:p>
-            <w:r>
-              <w:rPr>
-                <w:rFonts w:ascii="Arial" w:hAnsi="Arial"/>
-                <w:b w:val="0"/>
-                <w:i w:val="0"/>
-                <w:color w:val="232830"/>
-                <w:sz w:val="16"/>
-              </w:rPr>
-              <w:t>Active parenteral therapy. Vancomycin, piperacillin-tazobactam, and cefepime IV, culture-directed and renally dosed, ongoing per the 05/21 MAR. No oral conversion is established: the documented sulfa allergy excludes trimethoprim-sulfamethoxazole despite susceptibility, and Infectious Disease has not finalized an oral regimen (the 05/19 plan note states it is not a final discharge antibiotic synthesis). No OPAT or home infusion is arranged. Home-health wound nursing does not administer intravenous antibiotics.</w:t>
-            </w:r>
-          </w:p>
-        </w:tc>
-      </w:tr>
-      <w:tr>
-        <w:tc>
-          <w:tcPr>
-            <w:tcW w:type="dxa" w:w="5184"/>
-          </w:tcPr>
-          <w:p>
-            <w:r>
-              <w:rPr>
-                <w:rFonts w:ascii="Arial" w:hAnsi="Arial"/>
-                <w:b w:val="0"/>
-                <w:i w:val="0"/>
-                <w:color w:val="232830"/>
-                <w:sz w:val="16"/>
-              </w:rPr>
-              <w:t>Perfusion</w:t>
-            </w:r>
-          </w:p>
-        </w:tc>
-        <w:tc>
-          <w:tcPr>
-            <w:tcW w:type="dxa" w:w="5184"/>
-          </w:tcPr>
-          <w:p>
-            <w:r>
-              <w:rPr>
-                <w:rFonts w:ascii="Arial" w:hAnsi="Arial"/>
-                <w:b w:val="0"/>
-                <w:i w:val="0"/>
-                <w:color w:val="232830"/>
-                <w:sz w:val="16"/>
-              </w:rPr>
-              <w:t>Unresolved; reasonable to defer to outpatient vascular follow-up.</w:t>
-            </w:r>
-          </w:p>
-        </w:tc>
-      </w:tr>
-      <w:tr>
-        <w:tc>
-          <w:tcPr>
-            <w:tcW w:type="dxa" w:w="5184"/>
-            <w:shd w:val="clear" w:fill="EDF2FA"/>
-          </w:tcPr>
-          <w:p>
-            <w:r>
-              <w:rPr>
-                <w:rFonts w:ascii="Arial" w:hAnsi="Arial"/>
-                <w:b w:val="0"/>
-                <w:i w:val="0"/>
-                <w:color w:val="232830"/>
-                <w:sz w:val="16"/>
-              </w:rPr>
-              <w:t>Renal (AKI on CKD)</w:t>
-            </w:r>
-          </w:p>
-        </w:tc>
-        <w:tc>
-          <w:tcPr>
-            <w:tcW w:type="dxa" w:w="5184"/>
-            <w:shd w:val="clear" w:fill="EDF2FA"/>
-          </w:tcPr>
-          <w:p>
-            <w:r>
-              <w:rPr>
-                <w:rFonts w:ascii="Arial" w:hAnsi="Arial"/>
-                <w:b w:val="0"/>
-                <w:i w:val="0"/>
-                <w:color w:val="232830"/>
-                <w:sz w:val="16"/>
-              </w:rPr>
-              <w:t>Improving and stable. Creatinine 1.6, near baseline 1.5. Held agents pending restart parameters.</w:t>
-            </w:r>
-          </w:p>
-        </w:tc>
-      </w:tr>
-      <w:tr>
-        <w:tc>
-          <w:tcPr>
-            <w:tcW w:type="dxa" w:w="5184"/>
-          </w:tcPr>
-          <w:p>
-            <w:r>
-              <w:rPr>
-                <w:rFonts w:ascii="Arial" w:hAnsi="Arial"/>
-                <w:b w:val="0"/>
-                <w:i w:val="0"/>
-                <w:color w:val="232830"/>
-                <w:sz w:val="16"/>
-              </w:rPr>
-              <w:t>Offloading / mobility</w:t>
-            </w:r>
-          </w:p>
-        </w:tc>
-        <w:tc>
-          <w:tcPr>
-            <w:tcW w:type="dxa" w:w="5184"/>
-          </w:tcPr>
-          <w:p>
-            <w:r>
-              <w:rPr>
-                <w:rFonts w:ascii="Arial" w:hAnsi="Arial"/>
-                <w:b w:val="0"/>
-                <w:i w:val="0"/>
-                <w:color w:val="232830"/>
-                <w:sz w:val="16"/>
-              </w:rPr>
-              <w:t>Discharge planning in progress. Offloading device and stair clearance not yet completed.</w:t>
-            </w:r>
-          </w:p>
-        </w:tc>
-      </w:tr>
-      <w:tr>
-        <w:tc>
-          <w:tcPr>
-            <w:tcW w:type="dxa" w:w="5184"/>
-            <w:shd w:val="clear" w:fill="EDF2FA"/>
-          </w:tcPr>
-          <w:p>
-            <w:r>
-              <w:rPr>
-                <w:rFonts w:ascii="Arial" w:hAnsi="Arial"/>
-                <w:b w:val="0"/>
-                <w:i w:val="0"/>
-                <w:color w:val="232830"/>
-                <w:sz w:val="16"/>
-              </w:rPr>
-              <w:t>Home support</w:t>
-            </w:r>
-          </w:p>
-        </w:tc>
-        <w:tc>
-          <w:tcPr>
-            <w:tcW w:type="dxa" w:w="5184"/>
-            <w:shd w:val="clear" w:fill="EDF2FA"/>
-          </w:tcPr>
-          <w:p>
-            <w:r>
-              <w:rPr>
-                <w:rFonts w:ascii="Arial" w:hAnsi="Arial"/>
-                <w:b w:val="0"/>
-                <w:i w:val="0"/>
-                <w:color w:val="232830"/>
-                <w:sz w:val="16"/>
-              </w:rPr>
-              <w:t>Discharge planning in progress. Home-health wound nursing referral placed; caregiver teaching not complete.</w:t>
-            </w:r>
-          </w:p>
-        </w:tc>
-      </w:tr>
-      <w:tr>
-        <w:tc>
-          <w:tcPr>
-            <w:tcW w:type="dxa" w:w="5184"/>
-          </w:tcPr>
-          <w:p>
-            <w:r>
-              <w:rPr>
-                <w:rFonts w:ascii="Arial" w:hAnsi="Arial"/>
-                <w:b w:val="0"/>
-                <w:i w:val="0"/>
-                <w:color w:val="232830"/>
-                <w:sz w:val="16"/>
-              </w:rPr>
-              <w:t>Follow-up</w:t>
-            </w:r>
-          </w:p>
-        </w:tc>
-        <w:tc>
-          <w:tcPr>
-            <w:tcW w:type="dxa" w:w="5184"/>
-          </w:tcPr>
-          <w:p>
-            <w:r>
-              <w:rPr>
-                <w:rFonts w:ascii="Arial" w:hAnsi="Arial"/>
-                <w:b w:val="0"/>
-                <w:i w:val="0"/>
-                <w:color w:val="232830"/>
-                <w:sz w:val="16"/>
-              </w:rPr>
-              <w:t>Outpatient vascular, wound care, and primary care to be arranged.</w:t>
-            </w:r>
-          </w:p>
-        </w:tc>
-      </w:tr>
-    </w:tbl>
-    <w:p/>
-    <w:p>
-      <w:pPr>
-        <w:spacing w:before="180" w:after="60"/>
-        <w:pBdr>
-          <w:bottom w:val="single" w:sz="6" w:color="C9D4EA" w:space="2"/>
-        </w:pBdr>
-      </w:pPr>
-      <w:r>
-        <w:rPr>
-          <w:rFonts w:ascii="Arial" w:hAnsi="Arial"/>
-          <w:b/>
-          <w:i w:val="0"/>
-          <w:color w:val="4472C4"/>
-          <w:sz w:val="20"/>
-        </w:rPr>
-        <w:t>DETERMINATION</w:t>
+        <w:t>CRITERIA APPLIED, BOTH SIDES</w:t>
       </w:r>
     </w:p>
     <w:p>
+      <w:pPr>
+        <w:pStyle w:val="ListBullet"/>
+        <w:spacing w:after="30"/>
+      </w:pPr>
       <w:r>
         <w:rPr>
           <w:rFonts w:ascii="Arial" w:hAnsi="Arial"/>
@@ -985,7 +632,39 @@
           <w:color w:val="232830"/>
           <w:sz w:val="19"/>
         </w:rPr>
-        <w:t>Continued acute inpatient stay is medically necessary. The patient does not meet criteria for discharge home today. The active intravenous antibiotic requirement for a limb-threatening diabetic foot infection has no established oral conversion (sulfa allergy) and no OPAT arranged, and home-health wound nursing cannot administer intravenous antibiotics. Discharge home today would interrupt antibiotic therapy and risk treatment failure, readmission, and limb loss.</w:t>
+        <w:t>Improvement: afebrile, white count normalized to 8.9, creatinine improved to 1.6 near baseline. A treated infection and a recovering kidney injury.</w:t>
+      </w:r>
+    </w:p>
+    <w:p>
+      <w:pPr>
+        <w:pStyle w:val="ListBullet"/>
+        <w:spacing w:after="30"/>
+      </w:pPr>
+      <w:r>
+        <w:rPr>
+          <w:rFonts w:ascii="Arial" w:hAnsi="Arial"/>
+          <w:b w:val="0"/>
+          <w:i w:val="0"/>
+          <w:color w:val="232830"/>
+          <w:sz w:val="19"/>
+        </w:rPr>
+        <w:t>Active barriers: the parenteral antibiotic requirement above is the decisive one. Perfusion is also open on the formal study (noncompressible ankle indices, left toe pressure 55 mmHg, TBI 0.50), and the worksheet's home-readiness claims are optimistic, occupational-therapy offloading teach-back was not achieved and the home is a second-floor walk-up with limited caregiver coverage.</w:t>
+      </w:r>
+    </w:p>
+    <w:p>
+      <w:pPr>
+        <w:pStyle w:val="ListBullet"/>
+        <w:spacing w:after="30"/>
+      </w:pPr>
+      <w:r>
+        <w:rPr>
+          <w:rFonts w:ascii="Arial" w:hAnsi="Arial"/>
+          <w:b w:val="0"/>
+          <w:i w:val="0"/>
+          <w:color w:val="232830"/>
+          <w:sz w:val="19"/>
+        </w:rPr>
+        <w:t>Weighing: improving markers are not discharge readiness while the patient needs inpatient-administered intravenous antibiotics. The worksheet underweights the antibiotic route and overstates home readiness.</w:t>
       </w:r>
     </w:p>
     <w:p>
@@ -1003,7 +682,7 @@
           <w:color w:val="4472C4"/>
           <w:sz w:val="20"/>
         </w:rPr>
-        <w:t>PLAN TO CLEAR THE STAY</w:t>
+        <w:t>FINAL PHYSICIAN-ADVISOR ACTION</w:t>
       </w:r>
     </w:p>
     <w:p>
@@ -1015,37 +694,7 @@
           <w:color w:val="232830"/>
           <w:sz w:val="19"/>
         </w:rPr>
-        <w:t>Resolve the antibiotic route before discharge: establish a suitable oral regimen with Infectious Disease, accounting for the sulfa allergy and renal function, OR arrange a parenteral-capable level of care (OPAT or home infusion, or a skilled nursing facility) to complete the intravenous course. Complete offloading, stair clearance, and home-health setup in parallel. Re-review for discharge readiness when the antibiotic route and the home plan are confirmed.</w:t>
-      </w:r>
-    </w:p>
-    <w:p>
-      <w:pPr>
-        <w:spacing w:before="180" w:after="60"/>
-        <w:pBdr>
-          <w:bottom w:val="single" w:sz="6" w:color="C9D4EA" w:space="2"/>
-        </w:pBdr>
-      </w:pPr>
-      <w:r>
-        <w:rPr>
-          <w:rFonts w:ascii="Arial" w:hAnsi="Arial"/>
-          <w:b/>
-          <w:i w:val="0"/>
-          <w:color w:val="4472C4"/>
-          <w:sz w:val="20"/>
-        </w:rPr>
-        <w:t>DISPOSITION (FINAL)</w:t>
-      </w:r>
-    </w:p>
-    <w:p>
-      <w:r>
-        <w:rPr>
-          <w:rFonts w:ascii="Arial" w:hAnsi="Arial"/>
-          <w:b w:val="0"/>
-          <w:i w:val="0"/>
-          <w:color w:val="232830"/>
-          <w:sz w:val="19"/>
-        </w:rPr>
-        <w:t>Continued inpatient stay certified as medically necessary on hospital day 7. Discharge home today is not supported. Discharge only once the antibiotic route is resolved and the home plan is confirmed, or transition to a skilled facility capable of completing parenteral therapy.</w:t>
+        <w:t>Approve continued facility-level or skilled-level stay for 05/26/2026. Do not adopt the worksheet's lower-level position. Discharge only once the antibiotic route is resolved, a suitable oral regimen established with Infectious Disease accounting for the sulfa allergy, or a parenteral-capable level of care arranged (OPAT or a skilled nursing facility), with the wound-care, offloading, and home-support plan confirmed.</w:t>
       </w:r>
     </w:p>
     <w:p>
@@ -1063,7 +712,7 @@
           <w:color w:val="5E6670"/>
           <w:sz w:val="18"/>
         </w:rPr>
-        <w:t>Mara Olarte, RN - Utilization Review, 05/22/2026. Final for submission.</w:t>
+        <w:t>Electronically signed by Physician Advisor | Utilization Review | 05/26/2026 1100</w:t>
       </w:r>
     </w:p>
     <w:sectPr>
@@ -1096,7 +745,7 @@
         <w:color w:val="5E6670"/>
         <w:sz w:val="15"/>
       </w:rPr>
-      <w:t>Harbor Crest Regional Medical Center  |  CONCURRENT STAY REVIEW  |  Confidential</w:t>
+      <w:t>Harbor Crest Regional Medical Center  |  CONTINUED STAY DETERMINATION  |  Confidential</w:t>
     </w:r>
   </w:p>
 </w:ftr>
@@ -1116,7 +765,7 @@
         <w:color w:val="5E6670"/>
         <w:sz w:val="15"/>
       </w:rPr>
-      <w:t>Harbor Crest Regional Medical Center  |  CONCURRENT STAY REVIEW  |  Confidential</w:t>
+      <w:t>Harbor Crest Regional Medical Center  |  CONTINUED STAY DETERMINATION  |  Confidential</w:t>
     </w:r>
   </w:p>
 </w:ftr>
@@ -1136,7 +785,7 @@
         <w:color w:val="5E6670"/>
         <w:sz w:val="15"/>
       </w:rPr>
-      <w:t>Harbor Crest Regional Medical Center  |  CONCURRENT STAY REVIEW  |  Confidential</w:t>
+      <w:t>Harbor Crest Regional Medical Center  |  CONTINUED STAY DETERMINATION  |  Confidential</w:t>
     </w:r>
   </w:p>
 </w:ftr>

</xml_diff>

<commit_message>
OV08 golden: restore house continued-stay structure (drop invented LOAD-BEARING CORRECTION section, restore FLAGS FOR PHYSICIAN BEFORE SIGN); fold antibiotic-route catch into DETERMINATION + first both-sides bullet, matching build_goldens.OV06
</commit_message>
<xml_diff>
--- a/worlds/ondina-vasquell/phase-3-build-task-artifacts/platform/task8/current/golden-OV08-v1.docx
+++ b/worlds/ondina-vasquell/phase-3-build-task-artifacts/platform/task8/current/golden-OV08-v1.docx
@@ -568,37 +568,7 @@
           <w:color w:val="232830"/>
           <w:sz w:val="19"/>
         </w:rPr>
-        <w:t>I reviewed the first-level continued-stay worksheet. I do not adopt the preliminary lower-level determination. Continued facility-level or skilled-level care is justified as of 05/26/2026. The patient does not meet criteria for a safe step-down to an unsupported home setting.</w:t>
-      </w:r>
-    </w:p>
-    <w:p>
-      <w:pPr>
-        <w:spacing w:before="180" w:after="60"/>
-        <w:pBdr>
-          <w:bottom w:val="single" w:sz="6" w:color="C9D4EA" w:space="2"/>
-        </w:pBdr>
-      </w:pPr>
-      <w:r>
-        <w:rPr>
-          <w:rFonts w:ascii="Arial" w:hAnsi="Arial"/>
-          <w:b/>
-          <w:i w:val="0"/>
-          <w:color w:val="4472C4"/>
-          <w:sz w:val="20"/>
-        </w:rPr>
-        <w:t>LOAD-BEARING CORRECTION</w:t>
-      </w:r>
-    </w:p>
-    <w:p>
-      <w:r>
-        <w:rPr>
-          <w:rFonts w:ascii="Arial" w:hAnsi="Arial"/>
-          <w:b w:val="0"/>
-          <w:i w:val="0"/>
-          <w:color w:val="232830"/>
-          <w:sz w:val="19"/>
-        </w:rPr>
-        <w:t>The worksheet states the patient was transitioned to oral antibiotics. That is not supported. The medication record shows ongoing intravenous vancomycin, piperacillin-tazobactam, and cefepime through 05/21, and no oral regimen has been established. The documented sulfa allergy excludes trimethoprim-sulfamethoxazole despite susceptibility, and Infectious Disease has not finalized an oral step-down. The patient requires ongoing parenteral antibiotics for a limb-threatening infection, with no OPAT or home infusion arranged, and home-health wound nursing does not administer intravenous antibiotics. This alone makes discharge home unsafe and is the decisive error in the worksheet.</w:t>
+        <w:t>I reviewed the first-level continued-stay worksheet. I do not adopt the preliminary lower-level determination. Continued facility-level or skilled-level care is justified as of 05/26/2026. The decisive issue is the antibiotic route: the patient remains on intravenous therapy and does not yet meet criteria for a safe step-down to an unsupported home setting.</w:t>
       </w:r>
     </w:p>
     <w:p>
@@ -632,7 +602,7 @@
           <w:color w:val="232830"/>
           <w:sz w:val="19"/>
         </w:rPr>
-        <w:t>Improvement: afebrile, white count normalized to 8.9, creatinine improved to 1.6 near baseline. A treated infection and a recovering kidney injury.</w:t>
+        <w:t>Antibiotic route, the decisive barrier: the worksheet's entry that the patient was transitioned to oral antibiotics is not supported. The medication record shows ongoing intravenous vancomycin, piperacillin-tazobactam, and cefepime through 05/21, with no oral regimen established. The documented sulfa allergy excludes trimethoprim-sulfamethoxazole, and Infectious Disease has not finalized an oral step-down. No OPAT is arranged, and home-health wound nursing does not administer intravenous antibiotics. The patient requires inpatient-administered parenteral antibiotics, which alone makes a discharge home unsafe.</w:t>
       </w:r>
     </w:p>
     <w:p>
@@ -648,7 +618,7 @@
           <w:color w:val="232830"/>
           <w:sz w:val="19"/>
         </w:rPr>
-        <w:t>Active barriers: the parenteral antibiotic requirement above is the decisive one. Perfusion is also open on the formal study (noncompressible ankle indices, left toe pressure 55 mmHg, TBI 0.50), and the worksheet's home-readiness claims are optimistic, occupational-therapy offloading teach-back was not achieved and the home is a second-floor walk-up with limited caregiver coverage.</w:t>
+        <w:t>Improvement: afebrile, white count normalized to 8.9, creatinine improved to 1.6 near baseline. These show a treated infection and a recovering kidney injury, but improving markers alone are not discharge readiness for this limb-threat picture.</w:t>
       </w:r>
     </w:p>
     <w:p>
@@ -664,7 +634,7 @@
           <w:color w:val="232830"/>
           <w:sz w:val="19"/>
         </w:rPr>
-        <w:t>Weighing: improving markers are not discharge readiness while the patient needs inpatient-administered intravenous antibiotics. The worksheet underweights the antibiotic route and overstates home readiness.</w:t>
+        <w:t>Other open barriers: perfusion remains open on the formal vascular study (noncompressible ankle indices, left toe pressure 55 mmHg, left TBI 0.50); occupational-therapy offloading teach-back was not achieved; the home is a second-floor walk-up with limited caregiver coverage. The worksheet underweights these and overstates home readiness.</w:t>
       </w:r>
     </w:p>
     <w:p>
@@ -694,7 +664,41 @@
           <w:color w:val="232830"/>
           <w:sz w:val="19"/>
         </w:rPr>
-        <w:t>Approve continued facility-level or skilled-level stay for 05/26/2026. Do not adopt the worksheet's lower-level position. Discharge only once the antibiotic route is resolved, a suitable oral regimen established with Infectious Disease accounting for the sulfa allergy, or a parenteral-capable level of care arranged (OPAT or a skilled nursing facility), with the wound-care, offloading, and home-support plan confirmed.</w:t>
+        <w:t>Approve continued facility-level or skilled-level stay for 05/26/2026. Do not sign the worksheet's lower-level position as written. Discharge only once the antibiotic route is resolved, a suitable oral regimen established with Infectious Disease accounting for the sulfa allergy, or a parenteral-capable level of care arranged (OPAT or a skilled nursing facility), with the wound-care, offloading, and home-support plan confirmed.</w:t>
+      </w:r>
+    </w:p>
+    <w:p>
+      <w:pPr>
+        <w:spacing w:before="180" w:after="60"/>
+        <w:pBdr>
+          <w:bottom w:val="single" w:sz="6" w:color="C9D4EA" w:space="2"/>
+        </w:pBdr>
+      </w:pPr>
+      <w:r>
+        <w:rPr>
+          <w:rFonts w:ascii="Arial" w:hAnsi="Arial"/>
+          <w:b/>
+          <w:i w:val="0"/>
+          <w:color w:val="4472C4"/>
+          <w:sz w:val="20"/>
+        </w:rPr>
+        <w:t>FLAGS FOR PHYSICIAN BEFORE SIGN</w:t>
+      </w:r>
+    </w:p>
+    <w:p>
+      <w:pPr>
+        <w:pStyle w:val="ListBullet"/>
+        <w:spacing w:after="30"/>
+      </w:pPr>
+      <w:r>
+        <w:rPr>
+          <w:rFonts w:ascii="Arial" w:hAnsi="Arial"/>
+          <w:b w:val="0"/>
+          <w:i w:val="0"/>
+          <w:color w:val="232830"/>
+          <w:sz w:val="19"/>
+        </w:rPr>
+        <w:t>Confirm the antibiotic route, intravenous versus a finalized oral regimen, and the determination against the applicable continued-stay criteria set before signing.</w:t>
       </w:r>
     </w:p>
     <w:p>

</xml_diff>